<commit_message>
Adding file dialog to save summary to doc
</commit_message>
<xml_diff>
--- a/MeetingScribe/Assets/Template/VerbaleRiunione_Template.docx
+++ b/MeetingScribe/Assets/Template/VerbaleRiunione_Template.docx
@@ -1,10 +1,10 @@
 
 <file path=word/document.xml><?xml version="1.0" encoding="utf-8"?>
-<w:document xmlns:wpc="http://schemas.microsoft.com/office/word/2010/wordprocessingCanvas" xmlns:cx="http://schemas.microsoft.com/office/drawing/2014/chartex" xmlns:cx1="http://schemas.microsoft.com/office/drawing/2015/9/8/chartex" xmlns:cx2="http://schemas.microsoft.com/office/drawing/2015/10/21/chartex" xmlns:cx3="http://schemas.microsoft.com/office/drawing/2016/5/9/chartex" xmlns:cx4="http://schemas.microsoft.com/office/drawing/2016/5/10/chartex" xmlns:cx5="http://schemas.microsoft.com/office/drawing/2016/5/11/chartex" xmlns:cx6="http://schemas.microsoft.com/office/drawing/2016/5/12/chartex" xmlns:cx7="http://schemas.microsoft.com/office/drawing/2016/5/13/chartex" xmlns:cx8="http://schemas.microsoft.com/office/drawing/2016/5/14/chartex" xmlns:mc="http://schemas.openxmlformats.org/markup-compatibility/2006" xmlns:aink="http://schemas.microsoft.com/office/drawing/2016/ink" xmlns:am3d="http://schemas.microsoft.com/office/drawing/2017/model3d" xmlns:o="urn:schemas-microsoft-com:office:office" xmlns:oel="http://schemas.microsoft.com/office/2019/extlst" xmlns:r="http://schemas.openxmlformats.org/officeDocument/2006/relationships" xmlns:m="http://schemas.openxmlformats.org/officeDocument/2006/math" xmlns:v="urn:schemas-microsoft-com:vml" xmlns:wp14="http://schemas.microsoft.com/office/word/2010/wordprocessingDrawing" xmlns:wp="http://schemas.openxmlformats.org/drawingml/2006/wordprocessingDrawing" xmlns:w10="urn:schemas-microsoft-com:office:word" xmlns:w="http://schemas.openxmlformats.org/wordprocessingml/2006/main" xmlns:w14="http://schemas.microsoft.com/office/word/2010/wordml" xmlns:w15="http://schemas.microsoft.com/office/word/2012/wordml" xmlns:w16cex="http://schemas.microsoft.com/office/word/2018/wordml/cex" xmlns:w16cid="http://schemas.microsoft.com/office/word/2016/wordml/cid" xmlns:w16="http://schemas.microsoft.com/office/word/2018/wordml" xmlns:w16du="http://schemas.microsoft.com/office/word/2023/wordml/word16du" xmlns:w16sdtdh="http://schemas.microsoft.com/office/word/2020/wordml/sdtdatahash" xmlns:w16sdtfl="http://schemas.microsoft.com/office/word/2024/wordml/sdtformatlock" xmlns:w16se="http://schemas.microsoft.com/office/word/2015/wordml/symex" xmlns:wpg="http://schemas.microsoft.com/office/word/2010/wordprocessingGroup" xmlns:wpi="http://schemas.microsoft.com/office/word/2010/wordprocessingInk" xmlns:wne="http://schemas.microsoft.com/office/word/2006/wordml" xmlns:wps="http://schemas.microsoft.com/office/word/2010/wordprocessingShape" mc:Ignorable="w14 w15 w16se w16cid w16 w16cex w16sdtdh w16sdtfl w16du wp14">
+<w:document xmlns:wpc="http://schemas.microsoft.com/office/word/2010/wordprocessingCanvas" xmlns:cx="http://schemas.microsoft.com/office/drawing/2014/chartex" xmlns:cx1="http://schemas.microsoft.com/office/drawing/2015/9/8/chartex" xmlns:cx2="http://schemas.microsoft.com/office/drawing/2015/10/21/chartex" xmlns:cx3="http://schemas.microsoft.com/office/drawing/2016/5/9/chartex" xmlns:cx4="http://schemas.microsoft.com/office/drawing/2016/5/10/chartex" xmlns:cx5="http://schemas.microsoft.com/office/drawing/2016/5/11/chartex" xmlns:cx6="http://schemas.microsoft.com/office/drawing/2016/5/12/chartex" xmlns:cx7="http://schemas.microsoft.com/office/drawing/2016/5/13/chartex" xmlns:cx8="http://schemas.microsoft.com/office/drawing/2016/5/14/chartex" xmlns:mc="http://schemas.openxmlformats.org/markup-compatibility/2006" xmlns:aink="http://schemas.microsoft.com/office/drawing/2016/ink" xmlns:am3d="http://schemas.microsoft.com/office/drawing/2017/model3d" xmlns:o="urn:schemas-microsoft-com:office:office" xmlns:r="http://schemas.openxmlformats.org/officeDocument/2006/relationships" xmlns:m="http://schemas.openxmlformats.org/officeDocument/2006/math" xmlns:v="urn:schemas-microsoft-com:vml" xmlns:wp14="http://schemas.microsoft.com/office/word/2010/wordprocessingDrawing" xmlns:wp="http://schemas.openxmlformats.org/drawingml/2006/wordprocessingDrawing" xmlns:w10="urn:schemas-microsoft-com:office:word" xmlns:w="http://schemas.openxmlformats.org/wordprocessingml/2006/main" xmlns:w14="http://schemas.microsoft.com/office/word/2010/wordml" xmlns:w15="http://schemas.microsoft.com/office/word/2012/wordml" xmlns:w16cex="http://schemas.microsoft.com/office/word/2018/wordml/cex" xmlns:w16cid="http://schemas.microsoft.com/office/word/2016/wordml/cid" xmlns:w16="http://schemas.microsoft.com/office/word/2018/wordml" xmlns:w16sdtdh="http://schemas.microsoft.com/office/word/2020/wordml/sdtdatahash" xmlns:w16se="http://schemas.microsoft.com/office/word/2015/wordml/symex" xmlns:wpg="http://schemas.microsoft.com/office/word/2010/wordprocessingGroup" xmlns:wpi="http://schemas.microsoft.com/office/word/2010/wordprocessingInk" xmlns:wne="http://schemas.microsoft.com/office/word/2006/wordml" xmlns:wps="http://schemas.microsoft.com/office/word/2010/wordprocessingShape" mc:Ignorable="w14 w15 w16se w16cid w16 w16cex w16sdtdh wp14">
   <w:body>
     <w:p>
       <w:pPr>
-        <w:pStyle w:val="Titolo"/>
+        <w:pStyle w:val="Title"/>
       </w:pPr>
       <w:r>
         <w:rPr>
@@ -15,7 +15,7 @@
     </w:p>
     <w:p>
       <w:pPr>
-        <w:pStyle w:val="Titolo1"/>
+        <w:pStyle w:val="Heading1"/>
         <w:spacing w:before="188"/>
         <w:ind w:left="1039" w:right="1039"/>
         <w:jc w:val="center"/>
@@ -42,7 +42,7 @@
     </w:p>
     <w:p>
       <w:pPr>
-        <w:pStyle w:val="Corpotesto"/>
+        <w:pStyle w:val="BodyText"/>
         <w:spacing w:before="6"/>
         <w:rPr>
           <w:sz w:val="23"/>
@@ -122,6 +122,13 @@
                                 <w:sz w:val="28"/>
                               </w:rPr>
                               <w:t>DATA:</w:t>
+                            </w:r>
+                            <w:r>
+                              <w:rPr>
+                                <w:color w:val="FFFFFF"/>
+                                <w:sz w:val="28"/>
+                              </w:rPr>
+                              <w:t>{DATA}</w:t>
                             </w:r>
                             <w:r>
                               <w:rPr>
@@ -230,7 +237,7 @@
                 <v:stroke joinstyle="miter"/>
                 <v:path gradientshapeok="t" o:connecttype="rect"/>
               </v:shapetype>
-              <v:shape id="Casella di testo 2" o:spid="_x0000_s1026" type="#_x0000_t202" style="position:absolute;margin-left:69.75pt;margin-top:17pt;width:484.9pt;height:18pt;z-index:-251658240;visibility:visible;mso-wrap-style:square;mso-width-percent:0;mso-height-percent:0;mso-wrap-distance-left:0;mso-wrap-distance-top:0;mso-wrap-distance-right:0;mso-wrap-distance-bottom:0;mso-position-horizontal:absolute;mso-position-horizontal-relative:page;mso-position-vertical:absolute;mso-position-vertical-relative:text;mso-width-percent:0;mso-height-percent:0;mso-width-relative:page;mso-height-relative:page;v-text-anchor:top" o:gfxdata="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" fillcolor="#5eadde" stroked="f">
+              <v:shape id="Casella di testo 2" o:spid="_x0000_s1026" type="#_x0000_t202" style="position:absolute;margin-left:69.75pt;margin-top:17pt;width:484.9pt;height:18pt;z-index:-251658240;visibility:visible;mso-wrap-style:square;mso-width-percent:0;mso-height-percent:0;mso-wrap-distance-left:0;mso-wrap-distance-top:0;mso-wrap-distance-right:0;mso-wrap-distance-bottom:0;mso-position-horizontal:absolute;mso-position-horizontal-relative:page;mso-position-vertical:absolute;mso-position-vertical-relative:text;mso-width-percent:0;mso-height-percent:0;mso-width-relative:page;mso-height-relative:page;v-text-anchor:top" o:gfxdata="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" fillcolor="#5eadde" stroked="f">
                 <v:textbox inset="0,0,0,0">
                   <w:txbxContent>
                     <w:p>
@@ -250,6 +257,13 @@
                           <w:sz w:val="28"/>
                         </w:rPr>
                         <w:t>DATA:</w:t>
+                      </w:r>
+                      <w:r>
+                        <w:rPr>
+                          <w:color w:val="FFFFFF"/>
+                          <w:sz w:val="28"/>
+                        </w:rPr>
+                        <w:t>{DATA}</w:t>
                       </w:r>
                       <w:r>
                         <w:rPr>
@@ -346,7 +360,7 @@
     </w:p>
     <w:p>
       <w:pPr>
-        <w:pStyle w:val="Corpotesto"/>
+        <w:pStyle w:val="BodyText"/>
         <w:spacing w:before="9"/>
         <w:rPr>
           <w:sz w:val="33"/>
@@ -355,7 +369,7 @@
     </w:p>
     <w:p>
       <w:pPr>
-        <w:pStyle w:val="Corpotesto"/>
+        <w:pStyle w:val="BodyText"/>
         <w:spacing w:before="1" w:line="278" w:lineRule="auto"/>
         <w:ind w:left="1816" w:right="248" w:hanging="1560"/>
         <w:jc w:val="both"/>
@@ -379,54 +393,36 @@
         <w:t xml:space="preserve"> </w:t>
       </w:r>
       <w:r>
-        <w:t>Sarah Mancina (SM)</w:t>
-      </w:r>
-      <w:r>
-        <w:t>;</w:t>
-      </w:r>
-      <w:r>
-        <w:t xml:space="preserve"> Fabio Barbiero (FB); Stefano </w:t>
-      </w:r>
-      <w:proofErr w:type="spellStart"/>
-      <w:r>
-        <w:t>Tiné</w:t>
-      </w:r>
-      <w:proofErr w:type="spellEnd"/>
-      <w:r>
-        <w:t xml:space="preserve"> (ST); Leonardo D’Antuono</w:t>
+        <w:rPr>
+          <w:rFonts w:ascii="Arial" w:hAnsi="Arial"/>
+          <w:b/>
+          <w:spacing w:val="1"/>
+        </w:rPr>
+        <w:tab/>
       </w:r>
       <w:r>
         <w:rPr>
+          <w:rFonts w:ascii="Arial" w:hAnsi="Arial"/>
+          <w:bCs/>
           <w:spacing w:val="1"/>
         </w:rPr>
-        <w:t xml:space="preserve"> </w:t>
+        <w:t>{</w:t>
       </w:r>
       <w:r>
-        <w:t xml:space="preserve">(LD); Flavio Keller (FK); Siro Petruzzella (SP), Erica Piccinotti (EP); Lorena Pellegrino (LP); Walter </w:t>
-      </w:r>
-      <w:proofErr w:type="spellStart"/>
-      <w:r>
-        <w:t>Szabo</w:t>
-      </w:r>
-      <w:proofErr w:type="spellEnd"/>
-      <w:r>
-        <w:t xml:space="preserve"> (WS); </w:t>
+        <w:rPr>
+          <w:rFonts w:ascii="Arial" w:hAnsi="Arial"/>
+          <w:bCs/>
+          <w:spacing w:val="1"/>
+        </w:rPr>
+        <w:t>PARTS}</w:t>
       </w:r>
       <w:r>
-        <w:t xml:space="preserve">Serena </w:t>
-      </w:r>
-      <w:proofErr w:type="spellStart"/>
-      <w:r>
-        <w:t>Sonognini</w:t>
-      </w:r>
-      <w:proofErr w:type="spellEnd"/>
-      <w:r>
-        <w:t xml:space="preserve"> (SS); Tatiana Bello (TB); </w:t>
+        <w:t xml:space="preserve"> </w:t>
       </w:r>
     </w:p>
     <w:p>
       <w:pPr>
-        <w:pStyle w:val="Corpotesto"/>
+        <w:pStyle w:val="BodyText"/>
         <w:tabs>
           <w:tab w:val="left" w:pos="2279"/>
         </w:tabs>
@@ -435,6 +431,7 @@
         <w:jc w:val="both"/>
         <w:rPr>
           <w:bCs/>
+          <w:lang w:val="it-CH"/>
         </w:rPr>
       </w:pPr>
       <w:r>
@@ -451,10 +448,18 @@
         </w:rPr>
         <w:tab/>
       </w:r>
+      <w:r>
+        <w:rPr>
+          <w:rFonts w:ascii="Arial"/>
+          <w:bCs/>
+          <w:lang w:val="it-CH"/>
+        </w:rPr>
+        <w:t>{ASSEN}</w:t>
+      </w:r>
     </w:p>
     <w:p>
       <w:pPr>
-        <w:pStyle w:val="Titolo2"/>
+        <w:pStyle w:val="Heading2"/>
         <w:tabs>
           <w:tab w:val="left" w:pos="1801"/>
         </w:tabs>
@@ -463,6 +468,7 @@
         <w:rPr>
           <w:rFonts w:ascii="Arial MT"/>
           <w:b w:val="0"/>
+          <w:bCs w:val="0"/>
         </w:rPr>
       </w:pPr>
       <w:r>
@@ -472,6 +478,20 @@
         <w:tab/>
       </w:r>
       <w:bookmarkEnd w:id="0"/>
+      <w:r>
+        <w:rPr>
+          <w:b w:val="0"/>
+          <w:bCs w:val="0"/>
+        </w:rPr>
+        <w:t>MeetingScribe</w:t>
+      </w:r>
+      <w:r>
+        <w:rPr>
+          <w:b w:val="0"/>
+          <w:bCs w:val="0"/>
+        </w:rPr>
+        <w:t xml:space="preserve"> AI</w:t>
+      </w:r>
     </w:p>
     <w:p>
       <w:pPr>
@@ -530,7 +550,7 @@
     </w:p>
     <w:p>
       <w:pPr>
-        <w:pStyle w:val="Titolo2"/>
+        <w:pStyle w:val="Heading2"/>
         <w:numPr>
           <w:ilvl w:val="0"/>
           <w:numId w:val="29"/>
@@ -565,7 +585,7 @@
     </w:p>
     <w:p>
       <w:pPr>
-        <w:pStyle w:val="Corpotesto"/>
+        <w:pStyle w:val="BodyText"/>
         <w:numPr>
           <w:ilvl w:val="0"/>
           <w:numId w:val="30"/>
@@ -578,7 +598,7 @@
     </w:p>
     <w:p>
       <w:pPr>
-        <w:pStyle w:val="Titolo2"/>
+        <w:pStyle w:val="Heading2"/>
         <w:numPr>
           <w:ilvl w:val="0"/>
           <w:numId w:val="29"/>
@@ -604,7 +624,7 @@
     </w:p>
     <w:p>
       <w:pPr>
-        <w:pStyle w:val="Corpotesto"/>
+        <w:pStyle w:val="BodyText"/>
         <w:numPr>
           <w:ilvl w:val="0"/>
           <w:numId w:val="30"/>
@@ -617,7 +637,7 @@
     </w:p>
     <w:p>
       <w:pPr>
-        <w:pStyle w:val="Titolo2"/>
+        <w:pStyle w:val="Heading2"/>
         <w:numPr>
           <w:ilvl w:val="0"/>
           <w:numId w:val="29"/>
@@ -643,7 +663,7 @@
     </w:p>
     <w:p>
       <w:pPr>
-        <w:pStyle w:val="Corpotesto"/>
+        <w:pStyle w:val="BodyText"/>
         <w:numPr>
           <w:ilvl w:val="0"/>
           <w:numId w:val="30"/>
@@ -656,7 +676,7 @@
     </w:p>
     <w:p>
       <w:pPr>
-        <w:pStyle w:val="Titolo2"/>
+        <w:pStyle w:val="Heading2"/>
         <w:numPr>
           <w:ilvl w:val="0"/>
           <w:numId w:val="29"/>
@@ -708,7 +728,7 @@
           </w:tcPr>
           <w:p>
             <w:pPr>
-              <w:pStyle w:val="Paragrafoelenco"/>
+              <w:pStyle w:val="ListParagraph"/>
               <w:numPr>
                 <w:ilvl w:val="0"/>
                 <w:numId w:val="27"/>
@@ -759,7 +779,16 @@
                 <w:tab w:val="left" w:pos="2670"/>
               </w:tabs>
               <w:spacing w:after="120" w:line="240" w:lineRule="auto"/>
+              <w:rPr>
+                <w:lang w:val="en-US"/>
+              </w:rPr>
             </w:pPr>
+            <w:r>
+              <w:rPr>
+                <w:lang w:val="en-US"/>
+              </w:rPr>
+              <w:t>{DEREZ}</w:t>
+            </w:r>
           </w:p>
         </w:tc>
         <w:tc>
@@ -787,7 +816,7 @@
           </w:tcPr>
           <w:p>
             <w:pPr>
-              <w:pStyle w:val="Paragrafoelenco"/>
+              <w:pStyle w:val="ListParagraph"/>
               <w:numPr>
                 <w:ilvl w:val="0"/>
                 <w:numId w:val="27"/>
@@ -836,6 +865,9 @@
             <w:pPr>
               <w:spacing w:after="120" w:line="240" w:lineRule="auto"/>
             </w:pPr>
+            <w:r>
+              <w:t>{GEST}</w:t>
+            </w:r>
           </w:p>
         </w:tc>
         <w:tc>
@@ -925,6 +957,9 @@
               <w:spacing w:after="120" w:line="240" w:lineRule="auto"/>
               <w:jc w:val="left"/>
             </w:pPr>
+            <w:r>
+              <w:t>{OPER}</w:t>
+            </w:r>
           </w:p>
         </w:tc>
         <w:tc>
@@ -997,6 +1032,9 @@
               </w:numPr>
               <w:spacing w:after="120" w:line="240" w:lineRule="auto"/>
             </w:pPr>
+            <w:r>
+              <w:t>{EVENT}</w:t>
+            </w:r>
           </w:p>
         </w:tc>
         <w:tc>
@@ -1073,7 +1111,7 @@
           <w:sz w:val="20"/>
           <w:szCs w:val="20"/>
         </w:rPr>
-        <w:t>CS</w:t>
+        <w:t>AI</w:t>
       </w:r>
     </w:p>
     <w:p>
@@ -1120,7 +1158,7 @@
 </file>
 
 <file path=word/endnotes.xml><?xml version="1.0" encoding="utf-8"?>
-<w:endnotes xmlns:wpc="http://schemas.microsoft.com/office/word/2010/wordprocessingCanvas" xmlns:cx="http://schemas.microsoft.com/office/drawing/2014/chartex" xmlns:cx1="http://schemas.microsoft.com/office/drawing/2015/9/8/chartex" xmlns:cx2="http://schemas.microsoft.com/office/drawing/2015/10/21/chartex" xmlns:cx3="http://schemas.microsoft.com/office/drawing/2016/5/9/chartex" xmlns:cx4="http://schemas.microsoft.com/office/drawing/2016/5/10/chartex" xmlns:cx5="http://schemas.microsoft.com/office/drawing/2016/5/11/chartex" xmlns:cx6="http://schemas.microsoft.com/office/drawing/2016/5/12/chartex" xmlns:cx7="http://schemas.microsoft.com/office/drawing/2016/5/13/chartex" xmlns:cx8="http://schemas.microsoft.com/office/drawing/2016/5/14/chartex" xmlns:mc="http://schemas.openxmlformats.org/markup-compatibility/2006" xmlns:aink="http://schemas.microsoft.com/office/drawing/2016/ink" xmlns:am3d="http://schemas.microsoft.com/office/drawing/2017/model3d" xmlns:o="urn:schemas-microsoft-com:office:office" xmlns:oel="http://schemas.microsoft.com/office/2019/extlst" xmlns:r="http://schemas.openxmlformats.org/officeDocument/2006/relationships" xmlns:m="http://schemas.openxmlformats.org/officeDocument/2006/math" xmlns:v="urn:schemas-microsoft-com:vml" xmlns:wp14="http://schemas.microsoft.com/office/word/2010/wordprocessingDrawing" xmlns:wp="http://schemas.openxmlformats.org/drawingml/2006/wordprocessingDrawing" xmlns:w10="urn:schemas-microsoft-com:office:word" xmlns:w="http://schemas.openxmlformats.org/wordprocessingml/2006/main" xmlns:w14="http://schemas.microsoft.com/office/word/2010/wordml" xmlns:w15="http://schemas.microsoft.com/office/word/2012/wordml" xmlns:w16cex="http://schemas.microsoft.com/office/word/2018/wordml/cex" xmlns:w16cid="http://schemas.microsoft.com/office/word/2016/wordml/cid" xmlns:w16="http://schemas.microsoft.com/office/word/2018/wordml" xmlns:w16du="http://schemas.microsoft.com/office/word/2023/wordml/word16du" xmlns:w16sdtdh="http://schemas.microsoft.com/office/word/2020/wordml/sdtdatahash" xmlns:w16sdtfl="http://schemas.microsoft.com/office/word/2024/wordml/sdtformatlock" xmlns:w16se="http://schemas.microsoft.com/office/word/2015/wordml/symex" xmlns:wpg="http://schemas.microsoft.com/office/word/2010/wordprocessingGroup" xmlns:wpi="http://schemas.microsoft.com/office/word/2010/wordprocessingInk" xmlns:wne="http://schemas.microsoft.com/office/word/2006/wordml" xmlns:wps="http://schemas.microsoft.com/office/word/2010/wordprocessingShape" mc:Ignorable="w14 w15 w16se w16cid w16 w16cex w16sdtdh w16sdtfl w16du wp14">
+<w:endnotes xmlns:wpc="http://schemas.microsoft.com/office/word/2010/wordprocessingCanvas" xmlns:cx="http://schemas.microsoft.com/office/drawing/2014/chartex" xmlns:cx1="http://schemas.microsoft.com/office/drawing/2015/9/8/chartex" xmlns:cx2="http://schemas.microsoft.com/office/drawing/2015/10/21/chartex" xmlns:cx3="http://schemas.microsoft.com/office/drawing/2016/5/9/chartex" xmlns:cx4="http://schemas.microsoft.com/office/drawing/2016/5/10/chartex" xmlns:cx5="http://schemas.microsoft.com/office/drawing/2016/5/11/chartex" xmlns:cx6="http://schemas.microsoft.com/office/drawing/2016/5/12/chartex" xmlns:cx7="http://schemas.microsoft.com/office/drawing/2016/5/13/chartex" xmlns:cx8="http://schemas.microsoft.com/office/drawing/2016/5/14/chartex" xmlns:mc="http://schemas.openxmlformats.org/markup-compatibility/2006" xmlns:aink="http://schemas.microsoft.com/office/drawing/2016/ink" xmlns:am3d="http://schemas.microsoft.com/office/drawing/2017/model3d" xmlns:o="urn:schemas-microsoft-com:office:office" xmlns:r="http://schemas.openxmlformats.org/officeDocument/2006/relationships" xmlns:m="http://schemas.openxmlformats.org/officeDocument/2006/math" xmlns:v="urn:schemas-microsoft-com:vml" xmlns:wp14="http://schemas.microsoft.com/office/word/2010/wordprocessingDrawing" xmlns:wp="http://schemas.openxmlformats.org/drawingml/2006/wordprocessingDrawing" xmlns:w10="urn:schemas-microsoft-com:office:word" xmlns:w="http://schemas.openxmlformats.org/wordprocessingml/2006/main" xmlns:w14="http://schemas.microsoft.com/office/word/2010/wordml" xmlns:w15="http://schemas.microsoft.com/office/word/2012/wordml" xmlns:w16cex="http://schemas.microsoft.com/office/word/2018/wordml/cex" xmlns:w16cid="http://schemas.microsoft.com/office/word/2016/wordml/cid" xmlns:w16="http://schemas.microsoft.com/office/word/2018/wordml" xmlns:w16sdtdh="http://schemas.microsoft.com/office/word/2020/wordml/sdtdatahash" xmlns:w16se="http://schemas.microsoft.com/office/word/2015/wordml/symex" xmlns:wpg="http://schemas.microsoft.com/office/word/2010/wordprocessingGroup" xmlns:wpi="http://schemas.microsoft.com/office/word/2010/wordprocessingInk" xmlns:wne="http://schemas.microsoft.com/office/word/2006/wordml" xmlns:wps="http://schemas.microsoft.com/office/word/2010/wordprocessingShape" mc:Ignorable="w14 w15 w16se w16cid w16 w16cex w16sdtdh wp14">
   <w:endnote w:type="separator" w:id="-1">
     <w:p>
       <w:r>
@@ -1146,7 +1184,7 @@
 </file>
 
 <file path=word/footer1.xml><?xml version="1.0" encoding="utf-8"?>
-<w:ftr xmlns:wpc="http://schemas.microsoft.com/office/word/2010/wordprocessingCanvas" xmlns:cx="http://schemas.microsoft.com/office/drawing/2014/chartex" xmlns:cx1="http://schemas.microsoft.com/office/drawing/2015/9/8/chartex" xmlns:cx2="http://schemas.microsoft.com/office/drawing/2015/10/21/chartex" xmlns:cx3="http://schemas.microsoft.com/office/drawing/2016/5/9/chartex" xmlns:cx4="http://schemas.microsoft.com/office/drawing/2016/5/10/chartex" xmlns:cx5="http://schemas.microsoft.com/office/drawing/2016/5/11/chartex" xmlns:cx6="http://schemas.microsoft.com/office/drawing/2016/5/12/chartex" xmlns:cx7="http://schemas.microsoft.com/office/drawing/2016/5/13/chartex" xmlns:cx8="http://schemas.microsoft.com/office/drawing/2016/5/14/chartex" xmlns:mc="http://schemas.openxmlformats.org/markup-compatibility/2006" xmlns:aink="http://schemas.microsoft.com/office/drawing/2016/ink" xmlns:am3d="http://schemas.microsoft.com/office/drawing/2017/model3d" xmlns:o="urn:schemas-microsoft-com:office:office" xmlns:oel="http://schemas.microsoft.com/office/2019/extlst" xmlns:r="http://schemas.openxmlformats.org/officeDocument/2006/relationships" xmlns:m="http://schemas.openxmlformats.org/officeDocument/2006/math" xmlns:v="urn:schemas-microsoft-com:vml" xmlns:wp14="http://schemas.microsoft.com/office/word/2010/wordprocessingDrawing" xmlns:wp="http://schemas.openxmlformats.org/drawingml/2006/wordprocessingDrawing" xmlns:w10="urn:schemas-microsoft-com:office:word" xmlns:w="http://schemas.openxmlformats.org/wordprocessingml/2006/main" xmlns:w14="http://schemas.microsoft.com/office/word/2010/wordml" xmlns:w15="http://schemas.microsoft.com/office/word/2012/wordml" xmlns:w16cex="http://schemas.microsoft.com/office/word/2018/wordml/cex" xmlns:w16cid="http://schemas.microsoft.com/office/word/2016/wordml/cid" xmlns:w16="http://schemas.microsoft.com/office/word/2018/wordml" xmlns:w16du="http://schemas.microsoft.com/office/word/2023/wordml/word16du" xmlns:w16sdtdh="http://schemas.microsoft.com/office/word/2020/wordml/sdtdatahash" xmlns:w16sdtfl="http://schemas.microsoft.com/office/word/2024/wordml/sdtformatlock" xmlns:w16se="http://schemas.microsoft.com/office/word/2015/wordml/symex" xmlns:wpg="http://schemas.microsoft.com/office/word/2010/wordprocessingGroup" xmlns:wpi="http://schemas.microsoft.com/office/word/2010/wordprocessingInk" xmlns:wne="http://schemas.microsoft.com/office/word/2006/wordml" xmlns:wps="http://schemas.microsoft.com/office/word/2010/wordprocessingShape" mc:Ignorable="w14 w15 w16se w16cid w16 w16cex w16sdtdh w16sdtfl w16du wp14">
+<w:ftr xmlns:wpc="http://schemas.microsoft.com/office/word/2010/wordprocessingCanvas" xmlns:cx="http://schemas.microsoft.com/office/drawing/2014/chartex" xmlns:cx1="http://schemas.microsoft.com/office/drawing/2015/9/8/chartex" xmlns:cx2="http://schemas.microsoft.com/office/drawing/2015/10/21/chartex" xmlns:cx3="http://schemas.microsoft.com/office/drawing/2016/5/9/chartex" xmlns:cx4="http://schemas.microsoft.com/office/drawing/2016/5/10/chartex" xmlns:cx5="http://schemas.microsoft.com/office/drawing/2016/5/11/chartex" xmlns:cx6="http://schemas.microsoft.com/office/drawing/2016/5/12/chartex" xmlns:cx7="http://schemas.microsoft.com/office/drawing/2016/5/13/chartex" xmlns:cx8="http://schemas.microsoft.com/office/drawing/2016/5/14/chartex" xmlns:mc="http://schemas.openxmlformats.org/markup-compatibility/2006" xmlns:aink="http://schemas.microsoft.com/office/drawing/2016/ink" xmlns:am3d="http://schemas.microsoft.com/office/drawing/2017/model3d" xmlns:o="urn:schemas-microsoft-com:office:office" xmlns:r="http://schemas.openxmlformats.org/officeDocument/2006/relationships" xmlns:m="http://schemas.openxmlformats.org/officeDocument/2006/math" xmlns:v="urn:schemas-microsoft-com:vml" xmlns:wp14="http://schemas.microsoft.com/office/word/2010/wordprocessingDrawing" xmlns:wp="http://schemas.openxmlformats.org/drawingml/2006/wordprocessingDrawing" xmlns:w10="urn:schemas-microsoft-com:office:word" xmlns:w="http://schemas.openxmlformats.org/wordprocessingml/2006/main" xmlns:w14="http://schemas.microsoft.com/office/word/2010/wordml" xmlns:w15="http://schemas.microsoft.com/office/word/2012/wordml" xmlns:w16cex="http://schemas.microsoft.com/office/word/2018/wordml/cex" xmlns:w16cid="http://schemas.microsoft.com/office/word/2016/wordml/cid" xmlns:w16="http://schemas.microsoft.com/office/word/2018/wordml" xmlns:w16sdtdh="http://schemas.microsoft.com/office/word/2020/wordml/sdtdatahash" xmlns:w16se="http://schemas.microsoft.com/office/word/2015/wordml/symex" xmlns:wpg="http://schemas.microsoft.com/office/word/2010/wordprocessingGroup" xmlns:wpi="http://schemas.microsoft.com/office/word/2010/wordprocessingInk" xmlns:wne="http://schemas.microsoft.com/office/word/2006/wordml" xmlns:wps="http://schemas.microsoft.com/office/word/2010/wordprocessingShape" mc:Ignorable="w14 w15 w16se w16cid w16 w16cex w16sdtdh wp14">
   <w:p>
     <w:pPr>
       <w:pStyle w:val="01PiPaginaLabor"/>
@@ -1197,17 +1235,27 @@
     <w:r>
       <w:t xml:space="preserve"> di </w:t>
     </w:r>
-    <w:fldSimple w:instr=" NUMPAGES   \* MERGEFORMAT ">
-      <w:r>
-        <w:t>1</w:t>
-      </w:r>
-    </w:fldSimple>
+    <w:r>
+      <w:fldChar w:fldCharType="begin"/>
+    </w:r>
+    <w:r>
+      <w:instrText xml:space="preserve"> NUMPAGES   \* MERGEFORMAT </w:instrText>
+    </w:r>
+    <w:r>
+      <w:fldChar w:fldCharType="separate"/>
+    </w:r>
+    <w:r>
+      <w:t>1</w:t>
+    </w:r>
+    <w:r>
+      <w:fldChar w:fldCharType="end"/>
+    </w:r>
   </w:p>
 </w:ftr>
 </file>
 
 <file path=word/footnotes.xml><?xml version="1.0" encoding="utf-8"?>
-<w:footnotes xmlns:wpc="http://schemas.microsoft.com/office/word/2010/wordprocessingCanvas" xmlns:cx="http://schemas.microsoft.com/office/drawing/2014/chartex" xmlns:cx1="http://schemas.microsoft.com/office/drawing/2015/9/8/chartex" xmlns:cx2="http://schemas.microsoft.com/office/drawing/2015/10/21/chartex" xmlns:cx3="http://schemas.microsoft.com/office/drawing/2016/5/9/chartex" xmlns:cx4="http://schemas.microsoft.com/office/drawing/2016/5/10/chartex" xmlns:cx5="http://schemas.microsoft.com/office/drawing/2016/5/11/chartex" xmlns:cx6="http://schemas.microsoft.com/office/drawing/2016/5/12/chartex" xmlns:cx7="http://schemas.microsoft.com/office/drawing/2016/5/13/chartex" xmlns:cx8="http://schemas.microsoft.com/office/drawing/2016/5/14/chartex" xmlns:mc="http://schemas.openxmlformats.org/markup-compatibility/2006" xmlns:aink="http://schemas.microsoft.com/office/drawing/2016/ink" xmlns:am3d="http://schemas.microsoft.com/office/drawing/2017/model3d" xmlns:o="urn:schemas-microsoft-com:office:office" xmlns:oel="http://schemas.microsoft.com/office/2019/extlst" xmlns:r="http://schemas.openxmlformats.org/officeDocument/2006/relationships" xmlns:m="http://schemas.openxmlformats.org/officeDocument/2006/math" xmlns:v="urn:schemas-microsoft-com:vml" xmlns:wp14="http://schemas.microsoft.com/office/word/2010/wordprocessingDrawing" xmlns:wp="http://schemas.openxmlformats.org/drawingml/2006/wordprocessingDrawing" xmlns:w10="urn:schemas-microsoft-com:office:word" xmlns:w="http://schemas.openxmlformats.org/wordprocessingml/2006/main" xmlns:w14="http://schemas.microsoft.com/office/word/2010/wordml" xmlns:w15="http://schemas.microsoft.com/office/word/2012/wordml" xmlns:w16cex="http://schemas.microsoft.com/office/word/2018/wordml/cex" xmlns:w16cid="http://schemas.microsoft.com/office/word/2016/wordml/cid" xmlns:w16="http://schemas.microsoft.com/office/word/2018/wordml" xmlns:w16du="http://schemas.microsoft.com/office/word/2023/wordml/word16du" xmlns:w16sdtdh="http://schemas.microsoft.com/office/word/2020/wordml/sdtdatahash" xmlns:w16sdtfl="http://schemas.microsoft.com/office/word/2024/wordml/sdtformatlock" xmlns:w16se="http://schemas.microsoft.com/office/word/2015/wordml/symex" xmlns:wpg="http://schemas.microsoft.com/office/word/2010/wordprocessingGroup" xmlns:wpi="http://schemas.microsoft.com/office/word/2010/wordprocessingInk" xmlns:wne="http://schemas.microsoft.com/office/word/2006/wordml" xmlns:wps="http://schemas.microsoft.com/office/word/2010/wordprocessingShape" mc:Ignorable="w14 w15 w16se w16cid w16 w16cex w16sdtdh w16sdtfl w16du wp14">
+<w:footnotes xmlns:wpc="http://schemas.microsoft.com/office/word/2010/wordprocessingCanvas" xmlns:cx="http://schemas.microsoft.com/office/drawing/2014/chartex" xmlns:cx1="http://schemas.microsoft.com/office/drawing/2015/9/8/chartex" xmlns:cx2="http://schemas.microsoft.com/office/drawing/2015/10/21/chartex" xmlns:cx3="http://schemas.microsoft.com/office/drawing/2016/5/9/chartex" xmlns:cx4="http://schemas.microsoft.com/office/drawing/2016/5/10/chartex" xmlns:cx5="http://schemas.microsoft.com/office/drawing/2016/5/11/chartex" xmlns:cx6="http://schemas.microsoft.com/office/drawing/2016/5/12/chartex" xmlns:cx7="http://schemas.microsoft.com/office/drawing/2016/5/13/chartex" xmlns:cx8="http://schemas.microsoft.com/office/drawing/2016/5/14/chartex" xmlns:mc="http://schemas.openxmlformats.org/markup-compatibility/2006" xmlns:aink="http://schemas.microsoft.com/office/drawing/2016/ink" xmlns:am3d="http://schemas.microsoft.com/office/drawing/2017/model3d" xmlns:o="urn:schemas-microsoft-com:office:office" xmlns:r="http://schemas.openxmlformats.org/officeDocument/2006/relationships" xmlns:m="http://schemas.openxmlformats.org/officeDocument/2006/math" xmlns:v="urn:schemas-microsoft-com:vml" xmlns:wp14="http://schemas.microsoft.com/office/word/2010/wordprocessingDrawing" xmlns:wp="http://schemas.openxmlformats.org/drawingml/2006/wordprocessingDrawing" xmlns:w10="urn:schemas-microsoft-com:office:word" xmlns:w="http://schemas.openxmlformats.org/wordprocessingml/2006/main" xmlns:w14="http://schemas.microsoft.com/office/word/2010/wordml" xmlns:w15="http://schemas.microsoft.com/office/word/2012/wordml" xmlns:w16cex="http://schemas.microsoft.com/office/word/2018/wordml/cex" xmlns:w16cid="http://schemas.microsoft.com/office/word/2016/wordml/cid" xmlns:w16="http://schemas.microsoft.com/office/word/2018/wordml" xmlns:w16sdtdh="http://schemas.microsoft.com/office/word/2020/wordml/sdtdatahash" xmlns:w16se="http://schemas.microsoft.com/office/word/2015/wordml/symex" xmlns:wpg="http://schemas.microsoft.com/office/word/2010/wordprocessingGroup" xmlns:wpi="http://schemas.microsoft.com/office/word/2010/wordprocessingInk" xmlns:wne="http://schemas.microsoft.com/office/word/2006/wordml" xmlns:wps="http://schemas.microsoft.com/office/word/2010/wordprocessingShape" mc:Ignorable="w14 w15 w16se w16cid w16 w16cex w16sdtdh wp14">
   <w:footnote w:type="separator" w:id="-1">
     <w:p>
       <w:r>
@@ -1233,10 +1281,10 @@
 </file>
 
 <file path=word/header1.xml><?xml version="1.0" encoding="utf-8"?>
-<w:hdr xmlns:wpc="http://schemas.microsoft.com/office/word/2010/wordprocessingCanvas" xmlns:cx="http://schemas.microsoft.com/office/drawing/2014/chartex" xmlns:cx1="http://schemas.microsoft.com/office/drawing/2015/9/8/chartex" xmlns:cx2="http://schemas.microsoft.com/office/drawing/2015/10/21/chartex" xmlns:cx3="http://schemas.microsoft.com/office/drawing/2016/5/9/chartex" xmlns:cx4="http://schemas.microsoft.com/office/drawing/2016/5/10/chartex" xmlns:cx5="http://schemas.microsoft.com/office/drawing/2016/5/11/chartex" xmlns:cx6="http://schemas.microsoft.com/office/drawing/2016/5/12/chartex" xmlns:cx7="http://schemas.microsoft.com/office/drawing/2016/5/13/chartex" xmlns:cx8="http://schemas.microsoft.com/office/drawing/2016/5/14/chartex" xmlns:mc="http://schemas.openxmlformats.org/markup-compatibility/2006" xmlns:aink="http://schemas.microsoft.com/office/drawing/2016/ink" xmlns:am3d="http://schemas.microsoft.com/office/drawing/2017/model3d" xmlns:o="urn:schemas-microsoft-com:office:office" xmlns:oel="http://schemas.microsoft.com/office/2019/extlst" xmlns:r="http://schemas.openxmlformats.org/officeDocument/2006/relationships" xmlns:m="http://schemas.openxmlformats.org/officeDocument/2006/math" xmlns:v="urn:schemas-microsoft-com:vml" xmlns:wp14="http://schemas.microsoft.com/office/word/2010/wordprocessingDrawing" xmlns:wp="http://schemas.openxmlformats.org/drawingml/2006/wordprocessingDrawing" xmlns:w10="urn:schemas-microsoft-com:office:word" xmlns:w="http://schemas.openxmlformats.org/wordprocessingml/2006/main" xmlns:w14="http://schemas.microsoft.com/office/word/2010/wordml" xmlns:w15="http://schemas.microsoft.com/office/word/2012/wordml" xmlns:w16cex="http://schemas.microsoft.com/office/word/2018/wordml/cex" xmlns:w16cid="http://schemas.microsoft.com/office/word/2016/wordml/cid" xmlns:w16="http://schemas.microsoft.com/office/word/2018/wordml" xmlns:w16du="http://schemas.microsoft.com/office/word/2023/wordml/word16du" xmlns:w16sdtdh="http://schemas.microsoft.com/office/word/2020/wordml/sdtdatahash" xmlns:w16sdtfl="http://schemas.microsoft.com/office/word/2024/wordml/sdtformatlock" xmlns:w16se="http://schemas.microsoft.com/office/word/2015/wordml/symex" xmlns:wpg="http://schemas.microsoft.com/office/word/2010/wordprocessingGroup" xmlns:wpi="http://schemas.microsoft.com/office/word/2010/wordprocessingInk" xmlns:wne="http://schemas.microsoft.com/office/word/2006/wordml" xmlns:wps="http://schemas.microsoft.com/office/word/2010/wordprocessingShape" mc:Ignorable="w14 w15 w16se w16cid w16 w16cex w16sdtdh w16sdtfl w16du wp14">
+<w:hdr xmlns:wpc="http://schemas.microsoft.com/office/word/2010/wordprocessingCanvas" xmlns:cx="http://schemas.microsoft.com/office/drawing/2014/chartex" xmlns:cx1="http://schemas.microsoft.com/office/drawing/2015/9/8/chartex" xmlns:cx2="http://schemas.microsoft.com/office/drawing/2015/10/21/chartex" xmlns:cx3="http://schemas.microsoft.com/office/drawing/2016/5/9/chartex" xmlns:cx4="http://schemas.microsoft.com/office/drawing/2016/5/10/chartex" xmlns:cx5="http://schemas.microsoft.com/office/drawing/2016/5/11/chartex" xmlns:cx6="http://schemas.microsoft.com/office/drawing/2016/5/12/chartex" xmlns:cx7="http://schemas.microsoft.com/office/drawing/2016/5/13/chartex" xmlns:cx8="http://schemas.microsoft.com/office/drawing/2016/5/14/chartex" xmlns:mc="http://schemas.openxmlformats.org/markup-compatibility/2006" xmlns:aink="http://schemas.microsoft.com/office/drawing/2016/ink" xmlns:am3d="http://schemas.microsoft.com/office/drawing/2017/model3d" xmlns:o="urn:schemas-microsoft-com:office:office" xmlns:r="http://schemas.openxmlformats.org/officeDocument/2006/relationships" xmlns:m="http://schemas.openxmlformats.org/officeDocument/2006/math" xmlns:v="urn:schemas-microsoft-com:vml" xmlns:wp14="http://schemas.microsoft.com/office/word/2010/wordprocessingDrawing" xmlns:wp="http://schemas.openxmlformats.org/drawingml/2006/wordprocessingDrawing" xmlns:w10="urn:schemas-microsoft-com:office:word" xmlns:w="http://schemas.openxmlformats.org/wordprocessingml/2006/main" xmlns:w14="http://schemas.microsoft.com/office/word/2010/wordml" xmlns:w15="http://schemas.microsoft.com/office/word/2012/wordml" xmlns:w16cex="http://schemas.microsoft.com/office/word/2018/wordml/cex" xmlns:w16cid="http://schemas.microsoft.com/office/word/2016/wordml/cid" xmlns:w16="http://schemas.microsoft.com/office/word/2018/wordml" xmlns:w16sdtdh="http://schemas.microsoft.com/office/word/2020/wordml/sdtdatahash" xmlns:w16se="http://schemas.microsoft.com/office/word/2015/wordml/symex" xmlns:wpg="http://schemas.microsoft.com/office/word/2010/wordprocessingGroup" xmlns:wpi="http://schemas.microsoft.com/office/word/2010/wordprocessingInk" xmlns:wne="http://schemas.microsoft.com/office/word/2006/wordml" xmlns:wps="http://schemas.microsoft.com/office/word/2010/wordprocessingShape" mc:Ignorable="w14 w15 w16se w16cid w16 w16cex w16sdtdh wp14">
   <w:p>
     <w:pPr>
-      <w:pStyle w:val="Intestazione"/>
+      <w:pStyle w:val="Header"/>
     </w:pPr>
     <w:r>
       <w:rPr>
@@ -1262,7 +1310,7 @@
           <v:path o:extrusionok="f" gradientshapeok="t" o:connecttype="rect"/>
           <o:lock v:ext="edit" aspectratio="t"/>
         </v:shapetype>
-        <v:shape id="WordPictureWatermark2" o:spid="_x0000_s1026" type="#_x0000_t75" style="position:absolute;left:0;text-align:left;margin-left:0;margin-top:0;width:595.4pt;height:841.9pt;z-index:-251658239;mso-wrap-edited:f;mso-position-horizontal:center;mso-position-horizontal-relative:margin;mso-position-vertical:center;mso-position-vertical-relative:margin" wrapcoords="-27 0 -27 21561 21600 21561 21600 0 -27 0">
+        <v:shape id="WordPictureWatermark2" o:spid="_x0000_s2050" type="#_x0000_t75" style="position:absolute;left:0;text-align:left;margin-left:0;margin-top:0;width:595.4pt;height:841.9pt;z-index:-251658239;mso-wrap-edited:f;mso-position-horizontal:center;mso-position-horizontal-relative:margin;mso-position-vertical:center;mso-position-vertical-relative:margin" wrapcoords="-27 0 -27 21561 21600 21561 21600 0 -27 0">
           <v:imagedata r:id="rId1" o:title="formulario vert"/>
           <w10:wrap anchorx="margin" anchory="margin"/>
         </v:shape>
@@ -1273,10 +1321,10 @@
 </file>
 
 <file path=word/header2.xml><?xml version="1.0" encoding="utf-8"?>
-<w:hdr xmlns:wpc="http://schemas.microsoft.com/office/word/2010/wordprocessingCanvas" xmlns:cx="http://schemas.microsoft.com/office/drawing/2014/chartex" xmlns:cx1="http://schemas.microsoft.com/office/drawing/2015/9/8/chartex" xmlns:cx2="http://schemas.microsoft.com/office/drawing/2015/10/21/chartex" xmlns:cx3="http://schemas.microsoft.com/office/drawing/2016/5/9/chartex" xmlns:cx4="http://schemas.microsoft.com/office/drawing/2016/5/10/chartex" xmlns:cx5="http://schemas.microsoft.com/office/drawing/2016/5/11/chartex" xmlns:cx6="http://schemas.microsoft.com/office/drawing/2016/5/12/chartex" xmlns:cx7="http://schemas.microsoft.com/office/drawing/2016/5/13/chartex" xmlns:cx8="http://schemas.microsoft.com/office/drawing/2016/5/14/chartex" xmlns:mc="http://schemas.openxmlformats.org/markup-compatibility/2006" xmlns:aink="http://schemas.microsoft.com/office/drawing/2016/ink" xmlns:am3d="http://schemas.microsoft.com/office/drawing/2017/model3d" xmlns:o="urn:schemas-microsoft-com:office:office" xmlns:oel="http://schemas.microsoft.com/office/2019/extlst" xmlns:r="http://schemas.openxmlformats.org/officeDocument/2006/relationships" xmlns:m="http://schemas.openxmlformats.org/officeDocument/2006/math" xmlns:v="urn:schemas-microsoft-com:vml" xmlns:wp14="http://schemas.microsoft.com/office/word/2010/wordprocessingDrawing" xmlns:wp="http://schemas.openxmlformats.org/drawingml/2006/wordprocessingDrawing" xmlns:w10="urn:schemas-microsoft-com:office:word" xmlns:w="http://schemas.openxmlformats.org/wordprocessingml/2006/main" xmlns:w14="http://schemas.microsoft.com/office/word/2010/wordml" xmlns:w15="http://schemas.microsoft.com/office/word/2012/wordml" xmlns:w16cex="http://schemas.microsoft.com/office/word/2018/wordml/cex" xmlns:w16cid="http://schemas.microsoft.com/office/word/2016/wordml/cid" xmlns:w16="http://schemas.microsoft.com/office/word/2018/wordml" xmlns:w16du="http://schemas.microsoft.com/office/word/2023/wordml/word16du" xmlns:w16sdtdh="http://schemas.microsoft.com/office/word/2020/wordml/sdtdatahash" xmlns:w16sdtfl="http://schemas.microsoft.com/office/word/2024/wordml/sdtformatlock" xmlns:w16se="http://schemas.microsoft.com/office/word/2015/wordml/symex" xmlns:wpg="http://schemas.microsoft.com/office/word/2010/wordprocessingGroup" xmlns:wpi="http://schemas.microsoft.com/office/word/2010/wordprocessingInk" xmlns:wne="http://schemas.microsoft.com/office/word/2006/wordml" xmlns:wps="http://schemas.microsoft.com/office/word/2010/wordprocessingShape" mc:Ignorable="w14 w15 w16se w16cid w16 w16cex w16sdtdh w16sdtfl w16du wp14">
+<w:hdr xmlns:wpc="http://schemas.microsoft.com/office/word/2010/wordprocessingCanvas" xmlns:cx="http://schemas.microsoft.com/office/drawing/2014/chartex" xmlns:cx1="http://schemas.microsoft.com/office/drawing/2015/9/8/chartex" xmlns:cx2="http://schemas.microsoft.com/office/drawing/2015/10/21/chartex" xmlns:cx3="http://schemas.microsoft.com/office/drawing/2016/5/9/chartex" xmlns:cx4="http://schemas.microsoft.com/office/drawing/2016/5/10/chartex" xmlns:cx5="http://schemas.microsoft.com/office/drawing/2016/5/11/chartex" xmlns:cx6="http://schemas.microsoft.com/office/drawing/2016/5/12/chartex" xmlns:cx7="http://schemas.microsoft.com/office/drawing/2016/5/13/chartex" xmlns:cx8="http://schemas.microsoft.com/office/drawing/2016/5/14/chartex" xmlns:mc="http://schemas.openxmlformats.org/markup-compatibility/2006" xmlns:aink="http://schemas.microsoft.com/office/drawing/2016/ink" xmlns:am3d="http://schemas.microsoft.com/office/drawing/2017/model3d" xmlns:o="urn:schemas-microsoft-com:office:office" xmlns:r="http://schemas.openxmlformats.org/officeDocument/2006/relationships" xmlns:m="http://schemas.openxmlformats.org/officeDocument/2006/math" xmlns:v="urn:schemas-microsoft-com:vml" xmlns:wp14="http://schemas.microsoft.com/office/word/2010/wordprocessingDrawing" xmlns:wp="http://schemas.openxmlformats.org/drawingml/2006/wordprocessingDrawing" xmlns:w10="urn:schemas-microsoft-com:office:word" xmlns:w="http://schemas.openxmlformats.org/wordprocessingml/2006/main" xmlns:w14="http://schemas.microsoft.com/office/word/2010/wordml" xmlns:w15="http://schemas.microsoft.com/office/word/2012/wordml" xmlns:w16cex="http://schemas.microsoft.com/office/word/2018/wordml/cex" xmlns:w16cid="http://schemas.microsoft.com/office/word/2016/wordml/cid" xmlns:w16="http://schemas.microsoft.com/office/word/2018/wordml" xmlns:w16sdtdh="http://schemas.microsoft.com/office/word/2020/wordml/sdtdatahash" xmlns:w16se="http://schemas.microsoft.com/office/word/2015/wordml/symex" xmlns:wpg="http://schemas.microsoft.com/office/word/2010/wordprocessingGroup" xmlns:wpi="http://schemas.microsoft.com/office/word/2010/wordprocessingInk" xmlns:wne="http://schemas.microsoft.com/office/word/2006/wordml" xmlns:wps="http://schemas.microsoft.com/office/word/2010/wordprocessingShape" mc:Ignorable="w14 w15 w16se w16cid w16 w16cex w16sdtdh wp14">
   <w:p>
     <w:pPr>
-      <w:pStyle w:val="Intestazione"/>
+      <w:pStyle w:val="Header"/>
     </w:pPr>
     <w:r>
       <w:rPr>
@@ -1302,7 +1350,7 @@
           <v:path o:extrusionok="f" gradientshapeok="t" o:connecttype="rect"/>
           <o:lock v:ext="edit" aspectratio="t"/>
         </v:shapetype>
-        <v:shape id="WordPictureWatermark1" o:spid="_x0000_s1025" type="#_x0000_t75" style="position:absolute;left:0;text-align:left;margin-left:0;margin-top:0;width:595.4pt;height:841.9pt;z-index:-251658240;mso-wrap-edited:f;mso-position-horizontal-relative:page;mso-position-vertical-relative:page" wrapcoords="-27 0 -27 21561 21600 21561 21600 0 -27 0">
+        <v:shape id="WordPictureWatermark1" o:spid="_x0000_s2049" type="#_x0000_t75" style="position:absolute;left:0;text-align:left;margin-left:0;margin-top:0;width:595.4pt;height:841.9pt;z-index:-251658240;mso-wrap-edited:f;mso-position-horizontal-relative:page;mso-position-vertical-relative:page" wrapcoords="-27 0 -27 21561 21600 21561 21600 0 -27 0">
           <v:imagedata r:id="rId1" o:title="formulario vert"/>
           <w10:wrap anchorx="page" anchory="page"/>
           <w10:anchorlock/>
@@ -1314,10 +1362,10 @@
 </file>
 
 <file path=word/header3.xml><?xml version="1.0" encoding="utf-8"?>
-<w:hdr xmlns:wpc="http://schemas.microsoft.com/office/word/2010/wordprocessingCanvas" xmlns:cx="http://schemas.microsoft.com/office/drawing/2014/chartex" xmlns:cx1="http://schemas.microsoft.com/office/drawing/2015/9/8/chartex" xmlns:cx2="http://schemas.microsoft.com/office/drawing/2015/10/21/chartex" xmlns:cx3="http://schemas.microsoft.com/office/drawing/2016/5/9/chartex" xmlns:cx4="http://schemas.microsoft.com/office/drawing/2016/5/10/chartex" xmlns:cx5="http://schemas.microsoft.com/office/drawing/2016/5/11/chartex" xmlns:cx6="http://schemas.microsoft.com/office/drawing/2016/5/12/chartex" xmlns:cx7="http://schemas.microsoft.com/office/drawing/2016/5/13/chartex" xmlns:cx8="http://schemas.microsoft.com/office/drawing/2016/5/14/chartex" xmlns:mc="http://schemas.openxmlformats.org/markup-compatibility/2006" xmlns:aink="http://schemas.microsoft.com/office/drawing/2016/ink" xmlns:am3d="http://schemas.microsoft.com/office/drawing/2017/model3d" xmlns:o="urn:schemas-microsoft-com:office:office" xmlns:oel="http://schemas.microsoft.com/office/2019/extlst" xmlns:r="http://schemas.openxmlformats.org/officeDocument/2006/relationships" xmlns:m="http://schemas.openxmlformats.org/officeDocument/2006/math" xmlns:v="urn:schemas-microsoft-com:vml" xmlns:wp14="http://schemas.microsoft.com/office/word/2010/wordprocessingDrawing" xmlns:wp="http://schemas.openxmlformats.org/drawingml/2006/wordprocessingDrawing" xmlns:w10="urn:schemas-microsoft-com:office:word" xmlns:w="http://schemas.openxmlformats.org/wordprocessingml/2006/main" xmlns:w14="http://schemas.microsoft.com/office/word/2010/wordml" xmlns:w15="http://schemas.microsoft.com/office/word/2012/wordml" xmlns:w16cex="http://schemas.microsoft.com/office/word/2018/wordml/cex" xmlns:w16cid="http://schemas.microsoft.com/office/word/2016/wordml/cid" xmlns:w16="http://schemas.microsoft.com/office/word/2018/wordml" xmlns:w16du="http://schemas.microsoft.com/office/word/2023/wordml/word16du" xmlns:w16sdtdh="http://schemas.microsoft.com/office/word/2020/wordml/sdtdatahash" xmlns:w16sdtfl="http://schemas.microsoft.com/office/word/2024/wordml/sdtformatlock" xmlns:w16se="http://schemas.microsoft.com/office/word/2015/wordml/symex" xmlns:wpg="http://schemas.microsoft.com/office/word/2010/wordprocessingGroup" xmlns:wpi="http://schemas.microsoft.com/office/word/2010/wordprocessingInk" xmlns:wne="http://schemas.microsoft.com/office/word/2006/wordml" xmlns:wps="http://schemas.microsoft.com/office/word/2010/wordprocessingShape" mc:Ignorable="w14 w15 w16se w16cid w16 w16cex w16sdtdh w16sdtfl w16du wp14">
+<w:hdr xmlns:wpc="http://schemas.microsoft.com/office/word/2010/wordprocessingCanvas" xmlns:cx="http://schemas.microsoft.com/office/drawing/2014/chartex" xmlns:cx1="http://schemas.microsoft.com/office/drawing/2015/9/8/chartex" xmlns:cx2="http://schemas.microsoft.com/office/drawing/2015/10/21/chartex" xmlns:cx3="http://schemas.microsoft.com/office/drawing/2016/5/9/chartex" xmlns:cx4="http://schemas.microsoft.com/office/drawing/2016/5/10/chartex" xmlns:cx5="http://schemas.microsoft.com/office/drawing/2016/5/11/chartex" xmlns:cx6="http://schemas.microsoft.com/office/drawing/2016/5/12/chartex" xmlns:cx7="http://schemas.microsoft.com/office/drawing/2016/5/13/chartex" xmlns:cx8="http://schemas.microsoft.com/office/drawing/2016/5/14/chartex" xmlns:mc="http://schemas.openxmlformats.org/markup-compatibility/2006" xmlns:aink="http://schemas.microsoft.com/office/drawing/2016/ink" xmlns:am3d="http://schemas.microsoft.com/office/drawing/2017/model3d" xmlns:o="urn:schemas-microsoft-com:office:office" xmlns:r="http://schemas.openxmlformats.org/officeDocument/2006/relationships" xmlns:m="http://schemas.openxmlformats.org/officeDocument/2006/math" xmlns:v="urn:schemas-microsoft-com:vml" xmlns:wp14="http://schemas.microsoft.com/office/word/2010/wordprocessingDrawing" xmlns:wp="http://schemas.openxmlformats.org/drawingml/2006/wordprocessingDrawing" xmlns:w10="urn:schemas-microsoft-com:office:word" xmlns:w="http://schemas.openxmlformats.org/wordprocessingml/2006/main" xmlns:w14="http://schemas.microsoft.com/office/word/2010/wordml" xmlns:w15="http://schemas.microsoft.com/office/word/2012/wordml" xmlns:w16cex="http://schemas.microsoft.com/office/word/2018/wordml/cex" xmlns:w16cid="http://schemas.microsoft.com/office/word/2016/wordml/cid" xmlns:w16="http://schemas.microsoft.com/office/word/2018/wordml" xmlns:w16sdtdh="http://schemas.microsoft.com/office/word/2020/wordml/sdtdatahash" xmlns:w16se="http://schemas.microsoft.com/office/word/2015/wordml/symex" xmlns:wpg="http://schemas.microsoft.com/office/word/2010/wordprocessingGroup" xmlns:wpi="http://schemas.microsoft.com/office/word/2010/wordprocessingInk" xmlns:wne="http://schemas.microsoft.com/office/word/2006/wordml" xmlns:wps="http://schemas.microsoft.com/office/word/2010/wordprocessingShape" mc:Ignorable="w14 w15 w16se w16cid w16 w16cex w16sdtdh wp14">
   <w:p>
     <w:pPr>
-      <w:pStyle w:val="Intestazione"/>
+      <w:pStyle w:val="Header"/>
     </w:pPr>
     <w:r>
       <w:rPr>
@@ -1343,7 +1391,7 @@
           <v:path o:extrusionok="f" gradientshapeok="t" o:connecttype="rect"/>
           <o:lock v:ext="edit" aspectratio="t"/>
         </v:shapetype>
-        <v:shape id="WordPictureWatermark3" o:spid="_x0000_s1027" type="#_x0000_t75" style="position:absolute;left:0;text-align:left;margin-left:0;margin-top:0;width:595.4pt;height:841.9pt;z-index:-251658238;mso-wrap-edited:f;mso-position-horizontal:center;mso-position-horizontal-relative:margin;mso-position-vertical:center;mso-position-vertical-relative:margin" wrapcoords="-27 0 -27 21561 21600 21561 21600 0 -27 0">
+        <v:shape id="WordPictureWatermark3" o:spid="_x0000_s2051" type="#_x0000_t75" style="position:absolute;left:0;text-align:left;margin-left:0;margin-top:0;width:595.4pt;height:841.9pt;z-index:-251658238;mso-wrap-edited:f;mso-position-horizontal:center;mso-position-horizontal-relative:margin;mso-position-vertical:center;mso-position-vertical-relative:margin" wrapcoords="-27 0 -27 21561 21600 21561 21600 0 -27 0">
           <v:imagedata r:id="rId1" o:title="formulario vert"/>
           <w10:wrap anchorx="margin" anchory="margin"/>
         </v:shape>
@@ -1354,7 +1402,7 @@
 </file>
 
 <file path=word/numbering.xml><?xml version="1.0" encoding="utf-8"?>
-<w:numbering xmlns:wpc="http://schemas.microsoft.com/office/word/2010/wordprocessingCanvas" xmlns:cx="http://schemas.microsoft.com/office/drawing/2014/chartex" xmlns:cx1="http://schemas.microsoft.com/office/drawing/2015/9/8/chartex" xmlns:cx2="http://schemas.microsoft.com/office/drawing/2015/10/21/chartex" xmlns:cx3="http://schemas.microsoft.com/office/drawing/2016/5/9/chartex" xmlns:cx4="http://schemas.microsoft.com/office/drawing/2016/5/10/chartex" xmlns:cx5="http://schemas.microsoft.com/office/drawing/2016/5/11/chartex" xmlns:cx6="http://schemas.microsoft.com/office/drawing/2016/5/12/chartex" xmlns:cx7="http://schemas.microsoft.com/office/drawing/2016/5/13/chartex" xmlns:cx8="http://schemas.microsoft.com/office/drawing/2016/5/14/chartex" xmlns:mc="http://schemas.openxmlformats.org/markup-compatibility/2006" xmlns:aink="http://schemas.microsoft.com/office/drawing/2016/ink" xmlns:am3d="http://schemas.microsoft.com/office/drawing/2017/model3d" xmlns:o="urn:schemas-microsoft-com:office:office" xmlns:oel="http://schemas.microsoft.com/office/2019/extlst" xmlns:r="http://schemas.openxmlformats.org/officeDocument/2006/relationships" xmlns:m="http://schemas.openxmlformats.org/officeDocument/2006/math" xmlns:v="urn:schemas-microsoft-com:vml" xmlns:wp14="http://schemas.microsoft.com/office/word/2010/wordprocessingDrawing" xmlns:wp="http://schemas.openxmlformats.org/drawingml/2006/wordprocessingDrawing" xmlns:w10="urn:schemas-microsoft-com:office:word" xmlns:w="http://schemas.openxmlformats.org/wordprocessingml/2006/main" xmlns:w14="http://schemas.microsoft.com/office/word/2010/wordml" xmlns:w15="http://schemas.microsoft.com/office/word/2012/wordml" xmlns:w16cex="http://schemas.microsoft.com/office/word/2018/wordml/cex" xmlns:w16cid="http://schemas.microsoft.com/office/word/2016/wordml/cid" xmlns:w16="http://schemas.microsoft.com/office/word/2018/wordml" xmlns:w16du="http://schemas.microsoft.com/office/word/2023/wordml/word16du" xmlns:w16sdtdh="http://schemas.microsoft.com/office/word/2020/wordml/sdtdatahash" xmlns:w16sdtfl="http://schemas.microsoft.com/office/word/2024/wordml/sdtformatlock" xmlns:w16se="http://schemas.microsoft.com/office/word/2015/wordml/symex" xmlns:wpg="http://schemas.microsoft.com/office/word/2010/wordprocessingGroup" xmlns:wpi="http://schemas.microsoft.com/office/word/2010/wordprocessingInk" xmlns:wne="http://schemas.microsoft.com/office/word/2006/wordml" xmlns:wps="http://schemas.microsoft.com/office/word/2010/wordprocessingShape" mc:Ignorable="w14 w15 w16se w16cid w16 w16cex w16sdtdh w16sdtfl w16du wp14">
+<w:numbering xmlns:wpc="http://schemas.microsoft.com/office/word/2010/wordprocessingCanvas" xmlns:cx="http://schemas.microsoft.com/office/drawing/2014/chartex" xmlns:cx1="http://schemas.microsoft.com/office/drawing/2015/9/8/chartex" xmlns:cx2="http://schemas.microsoft.com/office/drawing/2015/10/21/chartex" xmlns:cx3="http://schemas.microsoft.com/office/drawing/2016/5/9/chartex" xmlns:cx4="http://schemas.microsoft.com/office/drawing/2016/5/10/chartex" xmlns:cx5="http://schemas.microsoft.com/office/drawing/2016/5/11/chartex" xmlns:cx6="http://schemas.microsoft.com/office/drawing/2016/5/12/chartex" xmlns:cx7="http://schemas.microsoft.com/office/drawing/2016/5/13/chartex" xmlns:cx8="http://schemas.microsoft.com/office/drawing/2016/5/14/chartex" xmlns:mc="http://schemas.openxmlformats.org/markup-compatibility/2006" xmlns:aink="http://schemas.microsoft.com/office/drawing/2016/ink" xmlns:am3d="http://schemas.microsoft.com/office/drawing/2017/model3d" xmlns:o="urn:schemas-microsoft-com:office:office" xmlns:r="http://schemas.openxmlformats.org/officeDocument/2006/relationships" xmlns:m="http://schemas.openxmlformats.org/officeDocument/2006/math" xmlns:v="urn:schemas-microsoft-com:vml" xmlns:wp14="http://schemas.microsoft.com/office/word/2010/wordprocessingDrawing" xmlns:wp="http://schemas.openxmlformats.org/drawingml/2006/wordprocessingDrawing" xmlns:w10="urn:schemas-microsoft-com:office:word" xmlns:w="http://schemas.openxmlformats.org/wordprocessingml/2006/main" xmlns:w14="http://schemas.microsoft.com/office/word/2010/wordml" xmlns:w15="http://schemas.microsoft.com/office/word/2012/wordml" xmlns:w16cex="http://schemas.microsoft.com/office/word/2018/wordml/cex" xmlns:w16cid="http://schemas.microsoft.com/office/word/2016/wordml/cid" xmlns:w16="http://schemas.microsoft.com/office/word/2018/wordml" xmlns:w16sdtdh="http://schemas.microsoft.com/office/word/2020/wordml/sdtdatahash" xmlns:w16se="http://schemas.microsoft.com/office/word/2015/wordml/symex" xmlns:wpg="http://schemas.microsoft.com/office/word/2010/wordprocessingGroup" xmlns:wpi="http://schemas.microsoft.com/office/word/2010/wordprocessingInk" xmlns:wne="http://schemas.microsoft.com/office/word/2006/wordml" xmlns:wps="http://schemas.microsoft.com/office/word/2010/wordprocessingShape" mc:Ignorable="w14 w15 w16se w16cid w16 w16cex w16sdtdh wp14">
   <w:abstractNum w:abstractNumId="0" w15:restartNumberingAfterBreak="0">
     <w:nsid w:val="027B49C6"/>
     <w:multiLevelType w:val="hybridMultilevel"/>
@@ -4377,101 +4425,101 @@
       </w:rPr>
     </w:lvl>
   </w:abstractNum>
-  <w:num w:numId="1" w16cid:durableId="1488203539">
+  <w:num w:numId="1">
     <w:abstractNumId w:val="22"/>
   </w:num>
-  <w:num w:numId="2" w16cid:durableId="966738007">
+  <w:num w:numId="2">
     <w:abstractNumId w:val="10"/>
   </w:num>
-  <w:num w:numId="3" w16cid:durableId="1629581257">
+  <w:num w:numId="3">
     <w:abstractNumId w:val="21"/>
   </w:num>
-  <w:num w:numId="4" w16cid:durableId="977563765">
+  <w:num w:numId="4">
     <w:abstractNumId w:val="14"/>
   </w:num>
-  <w:num w:numId="5" w16cid:durableId="739641959">
+  <w:num w:numId="5">
     <w:abstractNumId w:val="4"/>
   </w:num>
-  <w:num w:numId="6" w16cid:durableId="1746225806">
+  <w:num w:numId="6">
     <w:abstractNumId w:val="7"/>
   </w:num>
-  <w:num w:numId="7" w16cid:durableId="1745301180">
+  <w:num w:numId="7">
     <w:abstractNumId w:val="26"/>
   </w:num>
-  <w:num w:numId="8" w16cid:durableId="824665089">
+  <w:num w:numId="8">
     <w:abstractNumId w:val="21"/>
   </w:num>
-  <w:num w:numId="9" w16cid:durableId="342366681">
+  <w:num w:numId="9">
     <w:abstractNumId w:val="5"/>
   </w:num>
-  <w:num w:numId="10" w16cid:durableId="1454709931">
+  <w:num w:numId="10">
     <w:abstractNumId w:val="21"/>
   </w:num>
-  <w:num w:numId="11" w16cid:durableId="2062898690">
+  <w:num w:numId="11">
     <w:abstractNumId w:val="18"/>
   </w:num>
-  <w:num w:numId="12" w16cid:durableId="1289970204">
+  <w:num w:numId="12">
     <w:abstractNumId w:val="9"/>
   </w:num>
-  <w:num w:numId="13" w16cid:durableId="242640423">
+  <w:num w:numId="13">
     <w:abstractNumId w:val="0"/>
   </w:num>
-  <w:num w:numId="14" w16cid:durableId="2041929581">
+  <w:num w:numId="14">
     <w:abstractNumId w:val="2"/>
   </w:num>
-  <w:num w:numId="15" w16cid:durableId="1420828449">
+  <w:num w:numId="15">
     <w:abstractNumId w:val="27"/>
   </w:num>
-  <w:num w:numId="16" w16cid:durableId="693650560">
+  <w:num w:numId="16">
     <w:abstractNumId w:val="1"/>
   </w:num>
-  <w:num w:numId="17" w16cid:durableId="834108928">
+  <w:num w:numId="17">
     <w:abstractNumId w:val="16"/>
   </w:num>
-  <w:num w:numId="18" w16cid:durableId="554656870">
+  <w:num w:numId="18">
     <w:abstractNumId w:val="19"/>
   </w:num>
-  <w:num w:numId="19" w16cid:durableId="1140417004">
+  <w:num w:numId="19">
     <w:abstractNumId w:val="25"/>
   </w:num>
-  <w:num w:numId="20" w16cid:durableId="1002004974">
+  <w:num w:numId="20">
     <w:abstractNumId w:val="20"/>
   </w:num>
-  <w:num w:numId="21" w16cid:durableId="1743486683">
+  <w:num w:numId="21">
     <w:abstractNumId w:val="24"/>
   </w:num>
-  <w:num w:numId="22" w16cid:durableId="922832803">
+  <w:num w:numId="22">
     <w:abstractNumId w:val="17"/>
   </w:num>
-  <w:num w:numId="23" w16cid:durableId="687562997">
+  <w:num w:numId="23">
     <w:abstractNumId w:val="12"/>
   </w:num>
-  <w:num w:numId="24" w16cid:durableId="1536043866">
+  <w:num w:numId="24">
     <w:abstractNumId w:val="3"/>
   </w:num>
-  <w:num w:numId="25" w16cid:durableId="1843932923">
+  <w:num w:numId="25">
     <w:abstractNumId w:val="15"/>
   </w:num>
-  <w:num w:numId="26" w16cid:durableId="353697844">
+  <w:num w:numId="26">
     <w:abstractNumId w:val="8"/>
   </w:num>
-  <w:num w:numId="27" w16cid:durableId="2029326020">
+  <w:num w:numId="27">
     <w:abstractNumId w:val="23"/>
   </w:num>
-  <w:num w:numId="28" w16cid:durableId="2064984784">
+  <w:num w:numId="28">
     <w:abstractNumId w:val="11"/>
   </w:num>
-  <w:num w:numId="29" w16cid:durableId="953485114">
+  <w:num w:numId="29">
     <w:abstractNumId w:val="13"/>
   </w:num>
-  <w:num w:numId="30" w16cid:durableId="1168859976">
+  <w:num w:numId="30">
     <w:abstractNumId w:val="6"/>
   </w:num>
 </w:numbering>
 </file>
 
 <file path=word/styles.xml><?xml version="1.0" encoding="utf-8"?>
-<w:styles xmlns:mc="http://schemas.openxmlformats.org/markup-compatibility/2006" xmlns:r="http://schemas.openxmlformats.org/officeDocument/2006/relationships" xmlns:w="http://schemas.openxmlformats.org/wordprocessingml/2006/main" xmlns:w14="http://schemas.microsoft.com/office/word/2010/wordml" xmlns:w15="http://schemas.microsoft.com/office/word/2012/wordml" xmlns:w16cex="http://schemas.microsoft.com/office/word/2018/wordml/cex" xmlns:w16cid="http://schemas.microsoft.com/office/word/2016/wordml/cid" xmlns:w16="http://schemas.microsoft.com/office/word/2018/wordml" xmlns:w16du="http://schemas.microsoft.com/office/word/2023/wordml/word16du" xmlns:w16sdtdh="http://schemas.microsoft.com/office/word/2020/wordml/sdtdatahash" xmlns:w16sdtfl="http://schemas.microsoft.com/office/word/2024/wordml/sdtformatlock" xmlns:w16se="http://schemas.microsoft.com/office/word/2015/wordml/symex" mc:Ignorable="w14 w15 w16se w16cid w16 w16cex w16sdtdh w16sdtfl w16du">
+<w:styles xmlns:mc="http://schemas.openxmlformats.org/markup-compatibility/2006" xmlns:r="http://schemas.openxmlformats.org/officeDocument/2006/relationships" xmlns:w="http://schemas.openxmlformats.org/wordprocessingml/2006/main" xmlns:w14="http://schemas.microsoft.com/office/word/2010/wordml" xmlns:w15="http://schemas.microsoft.com/office/word/2012/wordml" xmlns:w16cex="http://schemas.microsoft.com/office/word/2018/wordml/cex" xmlns:w16cid="http://schemas.microsoft.com/office/word/2016/wordml/cid" xmlns:w16="http://schemas.microsoft.com/office/word/2018/wordml" xmlns:w16sdtdh="http://schemas.microsoft.com/office/word/2020/wordml/sdtdatahash" xmlns:w16se="http://schemas.microsoft.com/office/word/2015/wordml/symex" mc:Ignorable="w14 w15 w16se w16cid w16 w16cex w16sdtdh">
   <w:docDefaults>
     <w:rPrDefault>
       <w:rPr>
@@ -4861,7 +4909,7 @@
     <w:lsdException w:name="Unresolved Mention" w:semiHidden="1" w:unhideWhenUsed="1"/>
     <w:lsdException w:name="Smart Link" w:semiHidden="1" w:unhideWhenUsed="1"/>
   </w:latentStyles>
-  <w:style w:type="paragraph" w:default="1" w:styleId="Normale">
+  <w:style w:type="paragraph" w:default="1" w:styleId="Normal">
     <w:name w:val="Normal"/>
     <w:qFormat/>
     <w:rsid w:val="00812B78"/>
@@ -4876,10 +4924,10 @@
       <w:lang w:val="it-CH"/>
     </w:rPr>
   </w:style>
-  <w:style w:type="paragraph" w:styleId="Titolo1">
+  <w:style w:type="paragraph" w:styleId="Heading1">
     <w:name w:val="heading 1"/>
-    <w:basedOn w:val="Normale"/>
-    <w:link w:val="Titolo1Carattere"/>
+    <w:basedOn w:val="Normal"/>
+    <w:link w:val="Heading1Char"/>
     <w:uiPriority w:val="9"/>
     <w:qFormat/>
     <w:rsid w:val="005604C2"/>
@@ -4899,10 +4947,10 @@
       <w:lang w:val="it-IT" w:eastAsia="en-US"/>
     </w:rPr>
   </w:style>
-  <w:style w:type="paragraph" w:styleId="Titolo2">
+  <w:style w:type="paragraph" w:styleId="Heading2">
     <w:name w:val="heading 2"/>
-    <w:basedOn w:val="Normale"/>
-    <w:link w:val="Titolo2Carattere"/>
+    <w:basedOn w:val="Normal"/>
+    <w:link w:val="Heading2Char"/>
     <w:uiPriority w:val="9"/>
     <w:unhideWhenUsed/>
     <w:qFormat/>
@@ -4923,13 +4971,13 @@
       <w:lang w:val="it-IT" w:eastAsia="en-US"/>
     </w:rPr>
   </w:style>
-  <w:style w:type="character" w:default="1" w:styleId="Carpredefinitoparagrafo">
+  <w:style w:type="character" w:default="1" w:styleId="DefaultParagraphFont">
     <w:name w:val="Default Paragraph Font"/>
     <w:uiPriority w:val="1"/>
     <w:semiHidden/>
     <w:unhideWhenUsed/>
   </w:style>
-  <w:style w:type="table" w:default="1" w:styleId="Tabellanormale">
+  <w:style w:type="table" w:default="1" w:styleId="TableNormal">
     <w:name w:val="Normal Table"/>
     <w:uiPriority w:val="99"/>
     <w:semiHidden/>
@@ -4944,16 +4992,16 @@
       </w:tblCellMar>
     </w:tblPr>
   </w:style>
-  <w:style w:type="numbering" w:default="1" w:styleId="Nessunelenco">
+  <w:style w:type="numbering" w:default="1" w:styleId="NoList">
     <w:name w:val="No List"/>
     <w:uiPriority w:val="99"/>
     <w:semiHidden/>
     <w:unhideWhenUsed/>
   </w:style>
-  <w:style w:type="paragraph" w:styleId="Intestazione">
+  <w:style w:type="paragraph" w:styleId="Header">
     <w:name w:val="header"/>
-    <w:basedOn w:val="Normale"/>
-    <w:link w:val="IntestazioneCarattere"/>
+    <w:basedOn w:val="Normal"/>
+    <w:link w:val="HeaderChar"/>
     <w:uiPriority w:val="99"/>
     <w:unhideWhenUsed/>
     <w:rsid w:val="008F1CF8"/>
@@ -4964,17 +5012,17 @@
       </w:tabs>
     </w:pPr>
   </w:style>
-  <w:style w:type="character" w:customStyle="1" w:styleId="IntestazioneCarattere">
-    <w:name w:val="Intestazione Carattere"/>
-    <w:basedOn w:val="Carpredefinitoparagrafo"/>
-    <w:link w:val="Intestazione"/>
+  <w:style w:type="character" w:customStyle="1" w:styleId="HeaderChar">
+    <w:name w:val="Header Char"/>
+    <w:basedOn w:val="DefaultParagraphFont"/>
+    <w:link w:val="Header"/>
     <w:uiPriority w:val="99"/>
     <w:rsid w:val="008F1CF8"/>
   </w:style>
-  <w:style w:type="paragraph" w:styleId="Pidipagina">
+  <w:style w:type="paragraph" w:styleId="Footer">
     <w:name w:val="footer"/>
-    <w:basedOn w:val="Normale"/>
-    <w:link w:val="PidipaginaCarattere"/>
+    <w:basedOn w:val="Normal"/>
+    <w:link w:val="FooterChar"/>
     <w:uiPriority w:val="99"/>
     <w:unhideWhenUsed/>
     <w:rsid w:val="008F1CF8"/>
@@ -4985,17 +5033,17 @@
       </w:tabs>
     </w:pPr>
   </w:style>
-  <w:style w:type="character" w:customStyle="1" w:styleId="PidipaginaCarattere">
-    <w:name w:val="Piè di pagina Carattere"/>
-    <w:basedOn w:val="Carpredefinitoparagrafo"/>
-    <w:link w:val="Pidipagina"/>
+  <w:style w:type="character" w:customStyle="1" w:styleId="FooterChar">
+    <w:name w:val="Footer Char"/>
+    <w:basedOn w:val="DefaultParagraphFont"/>
+    <w:link w:val="Footer"/>
     <w:uiPriority w:val="99"/>
     <w:rsid w:val="008F1CF8"/>
   </w:style>
-  <w:style w:type="paragraph" w:styleId="Paragrafoelenco">
+  <w:style w:type="paragraph" w:styleId="ListParagraph">
     <w:name w:val="List Paragraph"/>
-    <w:basedOn w:val="Normale"/>
-    <w:link w:val="ParagrafoelencoCarattere"/>
+    <w:basedOn w:val="Normal"/>
+    <w:link w:val="ListParagraphChar"/>
     <w:uiPriority w:val="34"/>
     <w:qFormat/>
     <w:rsid w:val="004217CA"/>
@@ -5006,7 +5054,7 @@
   </w:style>
   <w:style w:type="paragraph" w:customStyle="1" w:styleId="01TitoloLabor">
     <w:name w:val="01_Titolo_Labor"/>
-    <w:basedOn w:val="Normale"/>
+    <w:basedOn w:val="Normal"/>
     <w:next w:val="01SottotitoloLabor"/>
     <w:link w:val="01TitoloLaborCarattere"/>
     <w:qFormat/>
@@ -5024,7 +5072,7 @@
   </w:style>
   <w:style w:type="paragraph" w:customStyle="1" w:styleId="02TitoloLabor">
     <w:name w:val="02_Titolo_Labor"/>
-    <w:basedOn w:val="Normale"/>
+    <w:basedOn w:val="Normal"/>
     <w:link w:val="02TitoloLaborCarattere"/>
     <w:qFormat/>
     <w:rsid w:val="00812B78"/>
@@ -5040,7 +5088,7 @@
   </w:style>
   <w:style w:type="character" w:customStyle="1" w:styleId="01TitoloLaborCarattere">
     <w:name w:val="01_Titolo_Labor Carattere"/>
-    <w:basedOn w:val="Carpredefinitoparagrafo"/>
+    <w:basedOn w:val="DefaultParagraphFont"/>
     <w:link w:val="01TitoloLabor"/>
     <w:rsid w:val="0021763A"/>
     <w:rPr>
@@ -5054,7 +5102,7 @@
   </w:style>
   <w:style w:type="paragraph" w:customStyle="1" w:styleId="04SottotitoloLabor">
     <w:name w:val="04_Sottotitolo_Labor"/>
-    <w:basedOn w:val="Normale"/>
+    <w:basedOn w:val="Normal"/>
     <w:link w:val="04SottotitoloLaborCarattere"/>
     <w:qFormat/>
     <w:rsid w:val="00812B78"/>
@@ -5068,7 +5116,7 @@
   </w:style>
   <w:style w:type="paragraph" w:customStyle="1" w:styleId="01SottotitoloLabor">
     <w:name w:val="01_Sottotitolo_Labor"/>
-    <w:basedOn w:val="Normale"/>
+    <w:basedOn w:val="Normal"/>
     <w:next w:val="01NormaleLabor"/>
     <w:link w:val="01SottotitoloLaborCarattere"/>
     <w:qFormat/>
@@ -5086,8 +5134,8 @@
   </w:style>
   <w:style w:type="paragraph" w:customStyle="1" w:styleId="02SottotitoloLabor">
     <w:name w:val="02_Sottotitolo_Labor"/>
-    <w:basedOn w:val="Normale"/>
-    <w:next w:val="Normale"/>
+    <w:basedOn w:val="Normal"/>
+    <w:next w:val="Normal"/>
     <w:link w:val="02SottotitoloLaborCarattere"/>
     <w:qFormat/>
     <w:rsid w:val="00812B78"/>
@@ -5103,7 +5151,7 @@
   </w:style>
   <w:style w:type="character" w:customStyle="1" w:styleId="01SottotitoloLaborCarattere">
     <w:name w:val="01_Sottotitolo_Labor Carattere"/>
-    <w:basedOn w:val="Carpredefinitoparagrafo"/>
+    <w:basedOn w:val="DefaultParagraphFont"/>
     <w:link w:val="01SottotitoloLabor"/>
     <w:rsid w:val="00812B78"/>
     <w:rPr>
@@ -5118,8 +5166,8 @@
   </w:style>
   <w:style w:type="paragraph" w:customStyle="1" w:styleId="03SottotitoloLabor">
     <w:name w:val="03_Sottotitolo_Labor"/>
-    <w:basedOn w:val="Normale"/>
-    <w:next w:val="Normale"/>
+    <w:basedOn w:val="Normal"/>
+    <w:next w:val="Normal"/>
     <w:link w:val="03SottotitoloLaborCarattere"/>
     <w:qFormat/>
     <w:rsid w:val="00812B78"/>
@@ -5133,7 +5181,7 @@
   </w:style>
   <w:style w:type="character" w:customStyle="1" w:styleId="02SottotitoloLaborCarattere">
     <w:name w:val="02_Sottotitolo_Labor Carattere"/>
-    <w:basedOn w:val="Carpredefinitoparagrafo"/>
+    <w:basedOn w:val="DefaultParagraphFont"/>
     <w:link w:val="02SottotitoloLabor"/>
     <w:rsid w:val="00812B78"/>
     <w:rPr>
@@ -5147,7 +5195,7 @@
   </w:style>
   <w:style w:type="paragraph" w:customStyle="1" w:styleId="01NormaleLabor">
     <w:name w:val="01_Normale_Labor"/>
-    <w:basedOn w:val="Normale"/>
+    <w:basedOn w:val="Normal"/>
     <w:link w:val="01NormaleLaborCarattere"/>
     <w:rsid w:val="00626D73"/>
     <w:pPr>
@@ -5156,7 +5204,7 @@
   </w:style>
   <w:style w:type="character" w:customStyle="1" w:styleId="03SottotitoloLaborCarattere">
     <w:name w:val="03_Sottotitolo_Labor Carattere"/>
-    <w:basedOn w:val="Carpredefinitoparagrafo"/>
+    <w:basedOn w:val="DefaultParagraphFont"/>
     <w:link w:val="03SottotitoloLabor"/>
     <w:rsid w:val="00812B78"/>
     <w:rPr>
@@ -5170,7 +5218,7 @@
   </w:style>
   <w:style w:type="character" w:customStyle="1" w:styleId="01NormaleLaborCarattere">
     <w:name w:val="01_Normale_Labor Carattere"/>
-    <w:basedOn w:val="Carpredefinitoparagrafo"/>
+    <w:basedOn w:val="DefaultParagraphFont"/>
     <w:link w:val="01NormaleLabor"/>
     <w:rsid w:val="00626D73"/>
     <w:rPr>
@@ -5182,7 +5230,7 @@
   </w:style>
   <w:style w:type="paragraph" w:customStyle="1" w:styleId="01CitazioneLabor">
     <w:name w:val="01_Citazione_Labor"/>
-    <w:basedOn w:val="Normale"/>
+    <w:basedOn w:val="Normal"/>
     <w:next w:val="01NormaleLabor"/>
     <w:link w:val="01CitazioneLaborCarattere"/>
     <w:qFormat/>
@@ -5196,7 +5244,7 @@
   </w:style>
   <w:style w:type="paragraph" w:customStyle="1" w:styleId="01ElencoLabor">
     <w:name w:val="01_Elenco_Labor"/>
-    <w:basedOn w:val="Paragrafoelenco"/>
+    <w:basedOn w:val="ListParagraph"/>
     <w:link w:val="01ElencoLaborCarattere"/>
     <w:qFormat/>
     <w:rsid w:val="00812B78"/>
@@ -5210,7 +5258,7 @@
   </w:style>
   <w:style w:type="character" w:customStyle="1" w:styleId="01CitazioneLaborCarattere">
     <w:name w:val="01_Citazione_Labor Carattere"/>
-    <w:basedOn w:val="Carpredefinitoparagrafo"/>
+    <w:basedOn w:val="DefaultParagraphFont"/>
     <w:link w:val="01CitazioneLabor"/>
     <w:rsid w:val="00812B78"/>
     <w:rPr>
@@ -5223,7 +5271,7 @@
   </w:style>
   <w:style w:type="paragraph" w:customStyle="1" w:styleId="02ElencoLabor">
     <w:name w:val="02_Elenco_Labor"/>
-    <w:basedOn w:val="Paragrafoelenco"/>
+    <w:basedOn w:val="ListParagraph"/>
     <w:link w:val="02ElencoLaborCarattere"/>
     <w:qFormat/>
     <w:rsid w:val="00812B78"/>
@@ -5234,16 +5282,16 @@
       <w:contextualSpacing w:val="0"/>
     </w:pPr>
   </w:style>
-  <w:style w:type="character" w:customStyle="1" w:styleId="ParagrafoelencoCarattere">
-    <w:name w:val="Paragrafo elenco Carattere"/>
-    <w:basedOn w:val="Carpredefinitoparagrafo"/>
-    <w:link w:val="Paragrafoelenco"/>
+  <w:style w:type="character" w:customStyle="1" w:styleId="ListParagraphChar">
+    <w:name w:val="List Paragraph Char"/>
+    <w:basedOn w:val="DefaultParagraphFont"/>
+    <w:link w:val="ListParagraph"/>
     <w:uiPriority w:val="34"/>
     <w:rsid w:val="0021763A"/>
   </w:style>
   <w:style w:type="character" w:customStyle="1" w:styleId="01ElencoLaborCarattere">
     <w:name w:val="01_Elenco_Labor Carattere"/>
-    <w:basedOn w:val="ParagrafoelencoCarattere"/>
+    <w:basedOn w:val="ListParagraphChar"/>
     <w:link w:val="01ElencoLabor"/>
     <w:rsid w:val="00812B78"/>
     <w:rPr>
@@ -5255,7 +5303,7 @@
   </w:style>
   <w:style w:type="paragraph" w:customStyle="1" w:styleId="03ElencoLabor">
     <w:name w:val="03_Elenco_Labor"/>
-    <w:basedOn w:val="Paragrafoelenco"/>
+    <w:basedOn w:val="ListParagraph"/>
     <w:link w:val="03ElencoLaborCarattere"/>
     <w:qFormat/>
     <w:rsid w:val="00812B78"/>
@@ -5268,7 +5316,7 @@
   </w:style>
   <w:style w:type="character" w:customStyle="1" w:styleId="02ElencoLaborCarattere">
     <w:name w:val="02_Elenco_Labor Carattere"/>
-    <w:basedOn w:val="ParagrafoelencoCarattere"/>
+    <w:basedOn w:val="ListParagraphChar"/>
     <w:link w:val="02ElencoLabor"/>
     <w:rsid w:val="00812B78"/>
     <w:rPr>
@@ -5280,7 +5328,7 @@
   </w:style>
   <w:style w:type="character" w:customStyle="1" w:styleId="03ElencoLaborCarattere">
     <w:name w:val="03_Elenco_Labor Carattere"/>
-    <w:basedOn w:val="ParagrafoelencoCarattere"/>
+    <w:basedOn w:val="ListParagraphChar"/>
     <w:link w:val="03ElencoLabor"/>
     <w:rsid w:val="00812B78"/>
     <w:rPr>
@@ -5292,7 +5340,7 @@
   </w:style>
   <w:style w:type="character" w:customStyle="1" w:styleId="02TitoloLaborCarattere">
     <w:name w:val="02_Titolo_Labor Carattere"/>
-    <w:basedOn w:val="Carpredefinitoparagrafo"/>
+    <w:basedOn w:val="DefaultParagraphFont"/>
     <w:link w:val="02TitoloLabor"/>
     <w:rsid w:val="00812B78"/>
     <w:rPr>
@@ -5306,7 +5354,7 @@
   </w:style>
   <w:style w:type="character" w:customStyle="1" w:styleId="04SottotitoloLaborCarattere">
     <w:name w:val="04_Sottotitolo_Labor Carattere"/>
-    <w:basedOn w:val="Carpredefinitoparagrafo"/>
+    <w:basedOn w:val="DefaultParagraphFont"/>
     <w:link w:val="04SottotitoloLabor"/>
     <w:rsid w:val="00812B78"/>
     <w:rPr>
@@ -5319,7 +5367,7 @@
   </w:style>
   <w:style w:type="paragraph" w:customStyle="1" w:styleId="01PiPaginaLabor">
     <w:name w:val="01_PiéPagina_Labor"/>
-    <w:basedOn w:val="Pidipagina"/>
+    <w:basedOn w:val="Footer"/>
     <w:link w:val="01PiPaginaLaborCarattere"/>
     <w:qFormat/>
     <w:rsid w:val="00A123CF"/>
@@ -5336,7 +5384,7 @@
   </w:style>
   <w:style w:type="character" w:customStyle="1" w:styleId="01PiPaginaLaborCarattere">
     <w:name w:val="01_PiéPagina_Labor Carattere"/>
-    <w:basedOn w:val="PidipaginaCarattere"/>
+    <w:basedOn w:val="FooterChar"/>
     <w:link w:val="01PiPaginaLabor"/>
     <w:rsid w:val="00A123CF"/>
     <w:rPr>
@@ -5347,9 +5395,9 @@
       <w:lang w:val="it-CH"/>
     </w:rPr>
   </w:style>
-  <w:style w:type="character" w:styleId="Collegamentoipertestuale">
+  <w:style w:type="character" w:styleId="Hyperlink">
     <w:name w:val="Hyperlink"/>
-    <w:basedOn w:val="Carpredefinitoparagrafo"/>
+    <w:basedOn w:val="DefaultParagraphFont"/>
     <w:uiPriority w:val="99"/>
     <w:unhideWhenUsed/>
     <w:rsid w:val="00365A2E"/>
@@ -5360,7 +5408,7 @@
   </w:style>
   <w:style w:type="paragraph" w:customStyle="1" w:styleId="Elencopuntatolabor">
     <w:name w:val="Elenco puntato (labor)"/>
-    <w:basedOn w:val="Nessunaspaziatura"/>
+    <w:basedOn w:val="NoSpacing"/>
     <w:rsid w:val="007D14C2"/>
     <w:pPr>
       <w:numPr>
@@ -5400,7 +5448,7 @@
   </w:style>
   <w:style w:type="character" w:customStyle="1" w:styleId="Elenco3livelloCarattere">
     <w:name w:val="Elenco3 livello Carattere"/>
-    <w:basedOn w:val="Carpredefinitoparagrafo"/>
+    <w:basedOn w:val="DefaultParagraphFont"/>
     <w:link w:val="Elenco3livello"/>
     <w:rsid w:val="007D14C2"/>
     <w:rPr>
@@ -5409,7 +5457,7 @@
       <w:lang w:val="en-US" w:eastAsia="en-US" w:bidi="en-US"/>
     </w:rPr>
   </w:style>
-  <w:style w:type="paragraph" w:styleId="Nessunaspaziatura">
+  <w:style w:type="paragraph" w:styleId="NoSpacing">
     <w:name w:val="No Spacing"/>
     <w:uiPriority w:val="1"/>
     <w:rsid w:val="007D14C2"/>
@@ -5423,10 +5471,10 @@
       <w:lang w:val="it-CH"/>
     </w:rPr>
   </w:style>
-  <w:style w:type="paragraph" w:styleId="Testofumetto">
+  <w:style w:type="paragraph" w:styleId="BalloonText">
     <w:name w:val="Balloon Text"/>
-    <w:basedOn w:val="Normale"/>
-    <w:link w:val="TestofumettoCarattere"/>
+    <w:basedOn w:val="Normal"/>
+    <w:link w:val="BalloonTextChar"/>
     <w:uiPriority w:val="99"/>
     <w:semiHidden/>
     <w:unhideWhenUsed/>
@@ -5440,10 +5488,10 @@
       <w:szCs w:val="16"/>
     </w:rPr>
   </w:style>
-  <w:style w:type="character" w:customStyle="1" w:styleId="TestofumettoCarattere">
-    <w:name w:val="Testo fumetto Carattere"/>
-    <w:basedOn w:val="Carpredefinitoparagrafo"/>
-    <w:link w:val="Testofumetto"/>
+  <w:style w:type="character" w:customStyle="1" w:styleId="BalloonTextChar">
+    <w:name w:val="Balloon Text Char"/>
+    <w:basedOn w:val="DefaultParagraphFont"/>
+    <w:link w:val="BalloonText"/>
     <w:uiPriority w:val="99"/>
     <w:semiHidden/>
     <w:rsid w:val="00107C26"/>
@@ -5454,10 +5502,10 @@
       <w:lang w:val="it-CH"/>
     </w:rPr>
   </w:style>
-  <w:style w:type="character" w:customStyle="1" w:styleId="Titolo1Carattere">
-    <w:name w:val="Titolo 1 Carattere"/>
-    <w:basedOn w:val="Carpredefinitoparagrafo"/>
-    <w:link w:val="Titolo1"/>
+  <w:style w:type="character" w:customStyle="1" w:styleId="Heading1Char">
+    <w:name w:val="Heading 1 Char"/>
+    <w:basedOn w:val="DefaultParagraphFont"/>
+    <w:link w:val="Heading1"/>
     <w:uiPriority w:val="9"/>
     <w:rsid w:val="005604C2"/>
     <w:rPr>
@@ -5467,10 +5515,10 @@
       <w:lang w:eastAsia="en-US"/>
     </w:rPr>
   </w:style>
-  <w:style w:type="character" w:customStyle="1" w:styleId="Titolo2Carattere">
-    <w:name w:val="Titolo 2 Carattere"/>
-    <w:basedOn w:val="Carpredefinitoparagrafo"/>
-    <w:link w:val="Titolo2"/>
+  <w:style w:type="character" w:customStyle="1" w:styleId="Heading2Char">
+    <w:name w:val="Heading 2 Char"/>
+    <w:basedOn w:val="DefaultParagraphFont"/>
+    <w:link w:val="Heading2"/>
     <w:uiPriority w:val="9"/>
     <w:rsid w:val="005604C2"/>
     <w:rPr>
@@ -5482,10 +5530,10 @@
       <w:lang w:eastAsia="en-US"/>
     </w:rPr>
   </w:style>
-  <w:style w:type="paragraph" w:styleId="Corpotesto">
+  <w:style w:type="paragraph" w:styleId="BodyText">
     <w:name w:val="Body Text"/>
-    <w:basedOn w:val="Normale"/>
-    <w:link w:val="CorpotestoCarattere"/>
+    <w:basedOn w:val="Normal"/>
+    <w:link w:val="BodyTextChar"/>
     <w:uiPriority w:val="1"/>
     <w:qFormat/>
     <w:rsid w:val="005604C2"/>
@@ -5501,10 +5549,10 @@
       <w:lang w:val="it-IT" w:eastAsia="en-US"/>
     </w:rPr>
   </w:style>
-  <w:style w:type="character" w:customStyle="1" w:styleId="CorpotestoCarattere">
-    <w:name w:val="Corpo testo Carattere"/>
-    <w:basedOn w:val="Carpredefinitoparagrafo"/>
-    <w:link w:val="Corpotesto"/>
+  <w:style w:type="character" w:customStyle="1" w:styleId="BodyTextChar">
+    <w:name w:val="Body Text Char"/>
+    <w:basedOn w:val="DefaultParagraphFont"/>
+    <w:link w:val="BodyText"/>
     <w:uiPriority w:val="1"/>
     <w:rsid w:val="005604C2"/>
     <w:rPr>
@@ -5514,10 +5562,10 @@
       <w:lang w:eastAsia="en-US"/>
     </w:rPr>
   </w:style>
-  <w:style w:type="paragraph" w:styleId="Titolo">
+  <w:style w:type="paragraph" w:styleId="Title">
     <w:name w:val="Title"/>
-    <w:basedOn w:val="Normale"/>
-    <w:link w:val="TitoloCarattere"/>
+    <w:basedOn w:val="Normal"/>
+    <w:link w:val="TitleChar"/>
     <w:uiPriority w:val="10"/>
     <w:qFormat/>
     <w:rsid w:val="005604C2"/>
@@ -5536,10 +5584,10 @@
       <w:lang w:val="it-IT" w:eastAsia="en-US"/>
     </w:rPr>
   </w:style>
-  <w:style w:type="character" w:customStyle="1" w:styleId="TitoloCarattere">
-    <w:name w:val="Titolo Carattere"/>
-    <w:basedOn w:val="Carpredefinitoparagrafo"/>
-    <w:link w:val="Titolo"/>
+  <w:style w:type="character" w:customStyle="1" w:styleId="TitleChar">
+    <w:name w:val="Title Char"/>
+    <w:basedOn w:val="DefaultParagraphFont"/>
+    <w:link w:val="Title"/>
     <w:uiPriority w:val="10"/>
     <w:rsid w:val="005604C2"/>
     <w:rPr>
@@ -5882,23 +5930,6 @@
 </file>
 
 <file path=customXml/item2.xml><?xml version="1.0" encoding="utf-8"?>
-<b:Sources xmlns:b="http://schemas.openxmlformats.org/officeDocument/2006/bibliography" xmlns="http://schemas.openxmlformats.org/officeDocument/2006/bibliography" SelectedStyle="\APA.XSL" StyleName="APA Fifth Edition"/>
-</file>
-
-<file path=customXml/item3.xml><?xml version="1.0" encoding="utf-8"?>
-<p:properties xmlns:p="http://schemas.microsoft.com/office/2006/metadata/properties" xmlns:xsi="http://www.w3.org/2001/XMLSchema-instance" xmlns:pc="http://schemas.microsoft.com/office/infopath/2007/PartnerControls">
-  <documentManagement>
-    <TaxCatchAll xmlns="c1a0a333-977f-4c4b-b62b-8bc9f909745b" xsi:nil="true"/>
-    <lcf76f155ced4ddcb4097134ff3c332f xmlns="df2924c1-27cb-460b-b2c4-978bb41ec4ad">
-      <Terms xmlns="http://schemas.microsoft.com/office/infopath/2007/PartnerControls"/>
-    </lcf76f155ced4ddcb4097134ff3c332f>
-    <_Flow_SignoffStatus xmlns="df2924c1-27cb-460b-b2c4-978bb41ec4ad" xsi:nil="true"/>
-    <Commento xmlns="df2924c1-27cb-460b-b2c4-978bb41ec4ad" xsi:nil="true"/>
-  </documentManagement>
-</p:properties>
-</file>
-
-<file path=customXml/item4.xml><?xml version="1.0" encoding="utf-8"?>
 <ct:contentTypeSchema xmlns:ct="http://schemas.microsoft.com/office/2006/metadata/contentType" xmlns:ma="http://schemas.microsoft.com/office/2006/metadata/properties/metaAttributes" ct:_="" ma:_="" ma:contentTypeName="Documento" ma:contentTypeID="0x010100E8ED20E3BB538643967B18AD079F7857" ma:contentTypeVersion="20" ma:contentTypeDescription="Creare un nuovo documento." ma:contentTypeScope="" ma:versionID="38564a621a20344efb2ddbef77586a14">
   <xsd:schema xmlns:xsd="http://www.w3.org/2001/XMLSchema" xmlns:xs="http://www.w3.org/2001/XMLSchema" xmlns:p="http://schemas.microsoft.com/office/2006/metadata/properties" xmlns:ns2="df2924c1-27cb-460b-b2c4-978bb41ec4ad" xmlns:ns3="c1a0a333-977f-4c4b-b62b-8bc9f909745b" targetNamespace="http://schemas.microsoft.com/office/2006/metadata/properties" ma:root="true" ma:fieldsID="8396291d017dff1bb133c49b9ea5e9a0" ns2:_="" ns3:_="">
     <xsd:import namespace="df2924c1-27cb-460b-b2c4-978bb41ec4ad"/>
@@ -6167,6 +6198,23 @@
 </ct:contentTypeSchema>
 </file>
 
+<file path=customXml/item3.xml><?xml version="1.0" encoding="utf-8"?>
+<p:properties xmlns:p="http://schemas.microsoft.com/office/2006/metadata/properties" xmlns:xsi="http://www.w3.org/2001/XMLSchema-instance" xmlns:pc="http://schemas.microsoft.com/office/infopath/2007/PartnerControls">
+  <documentManagement>
+    <TaxCatchAll xmlns="c1a0a333-977f-4c4b-b62b-8bc9f909745b" xsi:nil="true"/>
+    <lcf76f155ced4ddcb4097134ff3c332f xmlns="df2924c1-27cb-460b-b2c4-978bb41ec4ad">
+      <Terms xmlns="http://schemas.microsoft.com/office/infopath/2007/PartnerControls"/>
+    </lcf76f155ced4ddcb4097134ff3c332f>
+    <_Flow_SignoffStatus xmlns="df2924c1-27cb-460b-b2c4-978bb41ec4ad" xsi:nil="true"/>
+    <Commento xmlns="df2924c1-27cb-460b-b2c4-978bb41ec4ad" xsi:nil="true"/>
+  </documentManagement>
+</p:properties>
+</file>
+
+<file path=customXml/item4.xml><?xml version="1.0" encoding="utf-8"?>
+<b:Sources xmlns:b="http://schemas.openxmlformats.org/officeDocument/2006/bibliography" xmlns="http://schemas.openxmlformats.org/officeDocument/2006/bibliography" SelectedStyle="\APA.XSL" StyleName="APA Fifth Edition"/>
+</file>
+
 <file path=customXml/itemProps1.xml><?xml version="1.0" encoding="utf-8"?>
 <ds:datastoreItem xmlns:ds="http://schemas.openxmlformats.org/officeDocument/2006/customXml" ds:itemID="{D400AE2A-B1FE-4331-9E57-14CB4C5C186D}">
   <ds:schemaRefs>
@@ -6176,9 +6224,20 @@
 </file>
 
 <file path=customXml/itemProps2.xml><?xml version="1.0" encoding="utf-8"?>
-<ds:datastoreItem xmlns:ds="http://schemas.openxmlformats.org/officeDocument/2006/customXml" ds:itemID="{38D402A9-EFDD-475F-B659-62C22248053A}">
+<ds:datastoreItem xmlns:ds="http://schemas.openxmlformats.org/officeDocument/2006/customXml" ds:itemID="{812DEF69-C5A0-4BED-BFAB-A44632B1E8E0}">
   <ds:schemaRefs>
-    <ds:schemaRef ds:uri="http://schemas.openxmlformats.org/officeDocument/2006/bibliography"/>
+    <ds:schemaRef ds:uri="http://schemas.microsoft.com/office/2006/metadata/contentType"/>
+    <ds:schemaRef ds:uri="http://schemas.microsoft.com/office/2006/metadata/properties/metaAttributes"/>
+    <ds:schemaRef ds:uri="http://www.w3.org/2001/XMLSchema"/>
+    <ds:schemaRef ds:uri="http://schemas.microsoft.com/office/2006/metadata/properties"/>
+    <ds:schemaRef ds:uri="df2924c1-27cb-460b-b2c4-978bb41ec4ad"/>
+    <ds:schemaRef ds:uri="c1a0a333-977f-4c4b-b62b-8bc9f909745b"/>
+    <ds:schemaRef ds:uri="http://schemas.microsoft.com/office/2006/documentManagement/types"/>
+    <ds:schemaRef ds:uri="http://schemas.microsoft.com/office/infopath/2007/PartnerControls"/>
+    <ds:schemaRef ds:uri="http://schemas.openxmlformats.org/package/2006/metadata/core-properties"/>
+    <ds:schemaRef ds:uri="http://purl.org/dc/elements/1.1/"/>
+    <ds:schemaRef ds:uri="http://purl.org/dc/terms/"/>
+    <ds:schemaRef ds:uri="http://schemas.microsoft.com/internal/obd"/>
   </ds:schemaRefs>
 </ds:datastoreItem>
 </file>
@@ -6195,20 +6254,9 @@
 </file>
 
 <file path=customXml/itemProps4.xml><?xml version="1.0" encoding="utf-8"?>
-<ds:datastoreItem xmlns:ds="http://schemas.openxmlformats.org/officeDocument/2006/customXml" ds:itemID="{812DEF69-C5A0-4BED-BFAB-A44632B1E8E0}">
+<ds:datastoreItem xmlns:ds="http://schemas.openxmlformats.org/officeDocument/2006/customXml" ds:itemID="{38D402A9-EFDD-475F-B659-62C22248053A}">
   <ds:schemaRefs>
-    <ds:schemaRef ds:uri="http://schemas.microsoft.com/office/2006/metadata/contentType"/>
-    <ds:schemaRef ds:uri="http://schemas.microsoft.com/office/2006/metadata/properties/metaAttributes"/>
-    <ds:schemaRef ds:uri="http://www.w3.org/2001/XMLSchema"/>
-    <ds:schemaRef ds:uri="http://schemas.microsoft.com/office/2006/metadata/properties"/>
-    <ds:schemaRef ds:uri="df2924c1-27cb-460b-b2c4-978bb41ec4ad"/>
-    <ds:schemaRef ds:uri="c1a0a333-977f-4c4b-b62b-8bc9f909745b"/>
-    <ds:schemaRef ds:uri="http://schemas.microsoft.com/office/2006/documentManagement/types"/>
-    <ds:schemaRef ds:uri="http://schemas.microsoft.com/office/infopath/2007/PartnerControls"/>
-    <ds:schemaRef ds:uri="http://schemas.openxmlformats.org/package/2006/metadata/core-properties"/>
-    <ds:schemaRef ds:uri="http://purl.org/dc/elements/1.1/"/>
-    <ds:schemaRef ds:uri="http://purl.org/dc/terms/"/>
-    <ds:schemaRef ds:uri="http://schemas.microsoft.com/internal/obd"/>
+    <ds:schemaRef ds:uri="http://schemas.openxmlformats.org/officeDocument/2006/bibliography"/>
   </ds:schemaRefs>
 </ds:datastoreItem>
 </file>
</xml_diff>

<commit_message>
Saving template summary to doc file
</commit_message>
<xml_diff>
--- a/MeetingScribe/Assets/Template/VerbaleRiunione_Template.docx
+++ b/MeetingScribe/Assets/Template/VerbaleRiunione_Template.docx
@@ -128,7 +128,21 @@
                                 <w:color w:val="FFFFFF"/>
                                 <w:sz w:val="28"/>
                               </w:rPr>
-                              <w:t>{DATA}</w:t>
+                              <w:t>{DAT</w:t>
+                            </w:r>
+                            <w:r>
+                              <w:rPr>
+                                <w:color w:val="FFFFFF"/>
+                                <w:sz w:val="28"/>
+                              </w:rPr>
+                              <w:t>E</w:t>
+                            </w:r>
+                            <w:r>
+                              <w:rPr>
+                                <w:color w:val="FFFFFF"/>
+                                <w:sz w:val="28"/>
+                              </w:rPr>
+                              <w:t>}</w:t>
                             </w:r>
                             <w:r>
                               <w:rPr>
@@ -263,7 +277,21 @@
                           <w:color w:val="FFFFFF"/>
                           <w:sz w:val="28"/>
                         </w:rPr>
-                        <w:t>{DATA}</w:t>
+                        <w:t>{DAT</w:t>
+                      </w:r>
+                      <w:r>
+                        <w:rPr>
+                          <w:color w:val="FFFFFF"/>
+                          <w:sz w:val="28"/>
+                        </w:rPr>
+                        <w:t>E</w:t>
+                      </w:r>
+                      <w:r>
+                        <w:rPr>
+                          <w:color w:val="FFFFFF"/>
+                          <w:sz w:val="28"/>
+                        </w:rPr>
+                        <w:t>}</w:t>
                       </w:r>
                       <w:r>
                         <w:rPr>
@@ -483,14 +511,7 @@
           <w:b w:val="0"/>
           <w:bCs w:val="0"/>
         </w:rPr>
-        <w:t>MeetingScribe</w:t>
-      </w:r>
-      <w:r>
-        <w:rPr>
-          <w:b w:val="0"/>
-          <w:bCs w:val="0"/>
-        </w:rPr>
-        <w:t xml:space="preserve"> AI</w:t>
+        <w:t>MeetingScribe AI</w:t>
       </w:r>
     </w:p>
     <w:p>
@@ -548,150 +569,21 @@
         <w:t>giorno:</w:t>
       </w:r>
     </w:p>
+    <w:bookmarkEnd w:id="1"/>
+    <w:bookmarkEnd w:id="2"/>
     <w:p>
       <w:pPr>
-        <w:pStyle w:val="Heading2"/>
+        <w:pStyle w:val="03ElencoLabor"/>
         <w:numPr>
           <w:ilvl w:val="0"/>
-          <w:numId w:val="29"/>
+          <w:numId w:val="0"/>
         </w:numPr>
-        <w:tabs>
-          <w:tab w:val="left" w:pos="660"/>
-        </w:tabs>
-        <w:spacing w:before="120" w:after="120"/>
-        <w:ind w:left="720" w:hanging="360"/>
+        <w:ind w:left="360"/>
+        <w:jc w:val="left"/>
       </w:pPr>
       <w:r>
-        <w:t>Informazioni</w:t>
+        <w:t>{TOPICS}</w:t>
       </w:r>
-      <w:r>
-        <w:rPr>
-          <w:spacing w:val="-15"/>
-        </w:rPr>
-        <w:t xml:space="preserve"> </w:t>
-      </w:r>
-      <w:r>
-        <w:t>dalla</w:t>
-      </w:r>
-      <w:r>
-        <w:rPr>
-          <w:spacing w:val="-14"/>
-        </w:rPr>
-        <w:t xml:space="preserve"> </w:t>
-      </w:r>
-      <w:r>
-        <w:t>Direzione</w:t>
-      </w:r>
-    </w:p>
-    <w:p>
-      <w:pPr>
-        <w:pStyle w:val="BodyText"/>
-        <w:numPr>
-          <w:ilvl w:val="0"/>
-          <w:numId w:val="30"/>
-        </w:numPr>
-        <w:spacing w:before="120" w:after="120"/>
-        <w:rPr>
-          <w:sz w:val="24"/>
-        </w:rPr>
-      </w:pPr>
-    </w:p>
-    <w:p>
-      <w:pPr>
-        <w:pStyle w:val="Heading2"/>
-        <w:numPr>
-          <w:ilvl w:val="0"/>
-          <w:numId w:val="29"/>
-        </w:numPr>
-        <w:tabs>
-          <w:tab w:val="left" w:pos="660"/>
-        </w:tabs>
-        <w:spacing w:before="120" w:after="120"/>
-        <w:ind w:left="720" w:hanging="360"/>
-      </w:pPr>
-      <w:r>
-        <w:t>Parte</w:t>
-      </w:r>
-      <w:r>
-        <w:rPr>
-          <w:spacing w:val="-11"/>
-        </w:rPr>
-        <w:t xml:space="preserve"> </w:t>
-      </w:r>
-      <w:r>
-        <w:t>gestionale</w:t>
-      </w:r>
-    </w:p>
-    <w:p>
-      <w:pPr>
-        <w:pStyle w:val="BodyText"/>
-        <w:numPr>
-          <w:ilvl w:val="0"/>
-          <w:numId w:val="30"/>
-        </w:numPr>
-        <w:spacing w:before="120" w:after="120"/>
-        <w:rPr>
-          <w:sz w:val="21"/>
-        </w:rPr>
-      </w:pPr>
-    </w:p>
-    <w:p>
-      <w:pPr>
-        <w:pStyle w:val="Heading2"/>
-        <w:numPr>
-          <w:ilvl w:val="0"/>
-          <w:numId w:val="29"/>
-        </w:numPr>
-        <w:tabs>
-          <w:tab w:val="left" w:pos="660"/>
-        </w:tabs>
-        <w:spacing w:before="120" w:after="120"/>
-        <w:ind w:left="720" w:hanging="360"/>
-      </w:pPr>
-      <w:r>
-        <w:t>Parte</w:t>
-      </w:r>
-      <w:r>
-        <w:rPr>
-          <w:spacing w:val="-12"/>
-        </w:rPr>
-        <w:t xml:space="preserve"> </w:t>
-      </w:r>
-      <w:r>
-        <w:t>operativa</w:t>
-      </w:r>
-    </w:p>
-    <w:p>
-      <w:pPr>
-        <w:pStyle w:val="BodyText"/>
-        <w:numPr>
-          <w:ilvl w:val="0"/>
-          <w:numId w:val="30"/>
-        </w:numPr>
-        <w:spacing w:before="120" w:after="120"/>
-        <w:rPr>
-          <w:sz w:val="26"/>
-        </w:rPr>
-      </w:pPr>
-    </w:p>
-    <w:p>
-      <w:pPr>
-        <w:pStyle w:val="Heading2"/>
-        <w:numPr>
-          <w:ilvl w:val="0"/>
-          <w:numId w:val="29"/>
-        </w:numPr>
-        <w:tabs>
-          <w:tab w:val="left" w:pos="663"/>
-        </w:tabs>
-        <w:spacing w:before="120" w:after="120"/>
-        <w:ind w:left="662" w:hanging="357"/>
-      </w:pPr>
-      <w:r>
-        <w:t>Eventuali</w:t>
-      </w:r>
-      <w:bookmarkEnd w:id="1"/>
-      <w:bookmarkEnd w:id="2"/>
     </w:p>
     <w:p>
       <w:pPr>
@@ -1235,21 +1127,11 @@
     <w:r>
       <w:t xml:space="preserve"> di </w:t>
     </w:r>
-    <w:r>
-      <w:fldChar w:fldCharType="begin"/>
-    </w:r>
-    <w:r>
-      <w:instrText xml:space="preserve"> NUMPAGES   \* MERGEFORMAT </w:instrText>
-    </w:r>
-    <w:r>
-      <w:fldChar w:fldCharType="separate"/>
-    </w:r>
-    <w:r>
-      <w:t>1</w:t>
-    </w:r>
-    <w:r>
-      <w:fldChar w:fldCharType="end"/>
-    </w:r>
+    <w:fldSimple w:instr=" NUMPAGES   \* MERGEFORMAT ">
+      <w:r>
+        <w:t>1</w:t>
+      </w:r>
+    </w:fldSimple>
   </w:p>
 </w:ftr>
 </file>
@@ -5930,6 +5812,23 @@
 </file>
 
 <file path=customXml/item2.xml><?xml version="1.0" encoding="utf-8"?>
+<b:Sources xmlns:b="http://schemas.openxmlformats.org/officeDocument/2006/bibliography" xmlns="http://schemas.openxmlformats.org/officeDocument/2006/bibliography" SelectedStyle="\APA.XSL" StyleName="APA Fifth Edition"/>
+</file>
+
+<file path=customXml/item3.xml><?xml version="1.0" encoding="utf-8"?>
+<p:properties xmlns:p="http://schemas.microsoft.com/office/2006/metadata/properties" xmlns:xsi="http://www.w3.org/2001/XMLSchema-instance" xmlns:pc="http://schemas.microsoft.com/office/infopath/2007/PartnerControls">
+  <documentManagement>
+    <TaxCatchAll xmlns="c1a0a333-977f-4c4b-b62b-8bc9f909745b" xsi:nil="true"/>
+    <lcf76f155ced4ddcb4097134ff3c332f xmlns="df2924c1-27cb-460b-b2c4-978bb41ec4ad">
+      <Terms xmlns="http://schemas.microsoft.com/office/infopath/2007/PartnerControls"/>
+    </lcf76f155ced4ddcb4097134ff3c332f>
+    <_Flow_SignoffStatus xmlns="df2924c1-27cb-460b-b2c4-978bb41ec4ad" xsi:nil="true"/>
+    <Commento xmlns="df2924c1-27cb-460b-b2c4-978bb41ec4ad" xsi:nil="true"/>
+  </documentManagement>
+</p:properties>
+</file>
+
+<file path=customXml/item4.xml><?xml version="1.0" encoding="utf-8"?>
 <ct:contentTypeSchema xmlns:ct="http://schemas.microsoft.com/office/2006/metadata/contentType" xmlns:ma="http://schemas.microsoft.com/office/2006/metadata/properties/metaAttributes" ct:_="" ma:_="" ma:contentTypeName="Documento" ma:contentTypeID="0x010100E8ED20E3BB538643967B18AD079F7857" ma:contentTypeVersion="20" ma:contentTypeDescription="Creare un nuovo documento." ma:contentTypeScope="" ma:versionID="38564a621a20344efb2ddbef77586a14">
   <xsd:schema xmlns:xsd="http://www.w3.org/2001/XMLSchema" xmlns:xs="http://www.w3.org/2001/XMLSchema" xmlns:p="http://schemas.microsoft.com/office/2006/metadata/properties" xmlns:ns2="df2924c1-27cb-460b-b2c4-978bb41ec4ad" xmlns:ns3="c1a0a333-977f-4c4b-b62b-8bc9f909745b" targetNamespace="http://schemas.microsoft.com/office/2006/metadata/properties" ma:root="true" ma:fieldsID="8396291d017dff1bb133c49b9ea5e9a0" ns2:_="" ns3:_="">
     <xsd:import namespace="df2924c1-27cb-460b-b2c4-978bb41ec4ad"/>
@@ -6198,23 +6097,6 @@
 </ct:contentTypeSchema>
 </file>
 
-<file path=customXml/item3.xml><?xml version="1.0" encoding="utf-8"?>
-<p:properties xmlns:p="http://schemas.microsoft.com/office/2006/metadata/properties" xmlns:xsi="http://www.w3.org/2001/XMLSchema-instance" xmlns:pc="http://schemas.microsoft.com/office/infopath/2007/PartnerControls">
-  <documentManagement>
-    <TaxCatchAll xmlns="c1a0a333-977f-4c4b-b62b-8bc9f909745b" xsi:nil="true"/>
-    <lcf76f155ced4ddcb4097134ff3c332f xmlns="df2924c1-27cb-460b-b2c4-978bb41ec4ad">
-      <Terms xmlns="http://schemas.microsoft.com/office/infopath/2007/PartnerControls"/>
-    </lcf76f155ced4ddcb4097134ff3c332f>
-    <_Flow_SignoffStatus xmlns="df2924c1-27cb-460b-b2c4-978bb41ec4ad" xsi:nil="true"/>
-    <Commento xmlns="df2924c1-27cb-460b-b2c4-978bb41ec4ad" xsi:nil="true"/>
-  </documentManagement>
-</p:properties>
-</file>
-
-<file path=customXml/item4.xml><?xml version="1.0" encoding="utf-8"?>
-<b:Sources xmlns:b="http://schemas.openxmlformats.org/officeDocument/2006/bibliography" xmlns="http://schemas.openxmlformats.org/officeDocument/2006/bibliography" SelectedStyle="\APA.XSL" StyleName="APA Fifth Edition"/>
-</file>
-
 <file path=customXml/itemProps1.xml><?xml version="1.0" encoding="utf-8"?>
 <ds:datastoreItem xmlns:ds="http://schemas.openxmlformats.org/officeDocument/2006/customXml" ds:itemID="{D400AE2A-B1FE-4331-9E57-14CB4C5C186D}">
   <ds:schemaRefs>
@@ -6224,6 +6106,25 @@
 </file>
 
 <file path=customXml/itemProps2.xml><?xml version="1.0" encoding="utf-8"?>
+<ds:datastoreItem xmlns:ds="http://schemas.openxmlformats.org/officeDocument/2006/customXml" ds:itemID="{38D402A9-EFDD-475F-B659-62C22248053A}">
+  <ds:schemaRefs>
+    <ds:schemaRef ds:uri="http://schemas.openxmlformats.org/officeDocument/2006/bibliography"/>
+  </ds:schemaRefs>
+</ds:datastoreItem>
+</file>
+
+<file path=customXml/itemProps3.xml><?xml version="1.0" encoding="utf-8"?>
+<ds:datastoreItem xmlns:ds="http://schemas.openxmlformats.org/officeDocument/2006/customXml" ds:itemID="{49174DB4-2396-429B-ADC2-D5C04F764B1E}">
+  <ds:schemaRefs>
+    <ds:schemaRef ds:uri="http://schemas.microsoft.com/office/2006/metadata/properties"/>
+    <ds:schemaRef ds:uri="http://schemas.microsoft.com/office/infopath/2007/PartnerControls"/>
+    <ds:schemaRef ds:uri="c1a0a333-977f-4c4b-b62b-8bc9f909745b"/>
+    <ds:schemaRef ds:uri="df2924c1-27cb-460b-b2c4-978bb41ec4ad"/>
+  </ds:schemaRefs>
+</ds:datastoreItem>
+</file>
+
+<file path=customXml/itemProps4.xml><?xml version="1.0" encoding="utf-8"?>
 <ds:datastoreItem xmlns:ds="http://schemas.openxmlformats.org/officeDocument/2006/customXml" ds:itemID="{812DEF69-C5A0-4BED-BFAB-A44632B1E8E0}">
   <ds:schemaRefs>
     <ds:schemaRef ds:uri="http://schemas.microsoft.com/office/2006/metadata/contentType"/>
@@ -6240,23 +6141,4 @@
     <ds:schemaRef ds:uri="http://schemas.microsoft.com/internal/obd"/>
   </ds:schemaRefs>
 </ds:datastoreItem>
-</file>
-
-<file path=customXml/itemProps3.xml><?xml version="1.0" encoding="utf-8"?>
-<ds:datastoreItem xmlns:ds="http://schemas.openxmlformats.org/officeDocument/2006/customXml" ds:itemID="{49174DB4-2396-429B-ADC2-D5C04F764B1E}">
-  <ds:schemaRefs>
-    <ds:schemaRef ds:uri="http://schemas.microsoft.com/office/2006/metadata/properties"/>
-    <ds:schemaRef ds:uri="http://schemas.microsoft.com/office/infopath/2007/PartnerControls"/>
-    <ds:schemaRef ds:uri="c1a0a333-977f-4c4b-b62b-8bc9f909745b"/>
-    <ds:schemaRef ds:uri="df2924c1-27cb-460b-b2c4-978bb41ec4ad"/>
-  </ds:schemaRefs>
-</ds:datastoreItem>
-</file>
-
-<file path=customXml/itemProps4.xml><?xml version="1.0" encoding="utf-8"?>
-<ds:datastoreItem xmlns:ds="http://schemas.openxmlformats.org/officeDocument/2006/customXml" ds:itemID="{38D402A9-EFDD-475F-B659-62C22248053A}">
-  <ds:schemaRefs>
-    <ds:schemaRef ds:uri="http://schemas.openxmlformats.org/officeDocument/2006/bibliography"/>
-  </ds:schemaRefs>
-</ds:datastoreItem>
 </file>
</xml_diff>